<commit_message>
KfW pitch: neutral, more specific wording across all use cases
Co-Authored-By: Claude Fable 5.1 <noreply@anthropic.com>
Claude-Session: https://claude.ai/code/session_01WgH5MQtMPfeH2xdzPfnJgy
</commit_message>
<xml_diff>
--- a/pitch/KfW_KI-Anwendungsfaelle.docx
+++ b/pitch/KfW_KI-Anwendungsfaelle.docx
@@ -4,7 +4,7 @@
   <w:body>
     <w:p>
       <w:pPr>
-        <w:spacing w:after="320"/>
+        <w:spacing w:after="200"/>
       </w:pPr>
       <w:r>
         <w:drawing>
@@ -79,26 +79,26 @@
     </w:p>
     <w:p>
       <w:pPr>
-        <w:spacing w:after="160" w:before="0" w:line="312" w:lineRule="auto"/>
-      </w:pPr>
-      <w:r>
-        <w:rPr>
-          <w:sz w:val="24"/>
-          <w:szCs w:val="24"/>
-        </w:rPr>
-        <w:t xml:space="preserve">Die KfW prüft, dokumentiert und sichert heute mehr ab als je zuvor: DORA, neue EBA-Leitlinien, EZB-Schwerpunkt Cyber und IT-Kontrollen. Gleichzeitig entscheidet im Finanzierungsgeschäft der IPEX-Bank die Geschwindigkeit der Strukturierung über Mandate. Die Kapazität in Revision, Compliance, Security und Front Office wächst nicht im gleichen Tempo.</w:t>
-      </w:r>
-    </w:p>
-    <w:p>
-      <w:pPr>
-        <w:spacing w:after="440" w:before="0" w:line="312" w:lineRule="auto"/>
-      </w:pPr>
-      <w:r>
-        <w:rPr>
-          <w:sz w:val="24"/>
-          <w:szCs w:val="24"/>
-        </w:rPr>
-        <w:t xml:space="preserve">Die Antwort ist nicht ein weiterer Assistent, der Texte zusammenfasst. Sondern KI, die Quellen verknüpft, Risiken früher sichtbar macht, Entscheidungen vorbereitet und jede Aussage belegt. Acht Stellen, an denen das für die KfW einen messbaren Unterschied macht:</w:t>
+        <w:spacing w:after="120" w:before="0" w:line="300" w:lineRule="auto"/>
+      </w:pPr>
+      <w:r>
+        <w:rPr>
+          <w:sz w:val="22"/>
+          <w:szCs w:val="22"/>
+        </w:rPr>
+        <w:t xml:space="preserve">Die Anforderungen an Prüfung, Dokumentation und Absicherung nehmen zu: DORA, neue EBA-Leitlinien zu Drittparteienrisiken, Cyberresilienz und IT-Kontrollen als Aufsichtsschwerpunkt der EZB 2026–2028. Im Finanzierungsgeschäft der KfW IPEX-Bank entscheidet zugleich die Qualität und Geschwindigkeit der Strukturierung über Mandate. Die Fachkapazität in Revision, Compliance, IT-Security und Front Office wächst nicht im gleichen Maß.</w:t>
+      </w:r>
+    </w:p>
+    <w:p>
+      <w:pPr>
+        <w:spacing w:after="320" w:before="0" w:line="300" w:lineRule="auto"/>
+      </w:pPr>
+      <w:r>
+        <w:rPr>
+          <w:sz w:val="22"/>
+          <w:szCs w:val="22"/>
+        </w:rPr>
+        <w:t xml:space="preserve">Die KfW verfügt über etablierte Prozesse und erste KI-Anwendungen. Der nächste Schritt sind Systeme, die Quellen miteinander verknüpfen, Abweichungen und Risiken früher sichtbar machen, Entscheidungen vorbereiten und jede Aussage mit einem Nachweis versehen. Acht Anwendungsfälle entlang bestehender KfW-Prozesse:</w:t>
       </w:r>
     </w:p>
     <w:tbl>
@@ -152,7 +152,7 @@
           </w:p>
           <w:p>
             <w:pPr>
-              <w:spacing w:after="160" w:line="288" w:lineRule="auto"/>
+              <w:spacing w:after="120" w:line="276" w:lineRule="auto"/>
             </w:pPr>
             <w:r>
               <w:rPr>
@@ -174,15 +174,15 @@
             </w:r>
             <w:r>
               <w:rPr>
-                <w:sz w:val="21"/>
-                <w:szCs w:val="21"/>
-              </w:rPr>
-              <w:t xml:space="preserve">  Neue Regulierung automatisch gegen die SFO abgleichen.</w:t>
-            </w:r>
-          </w:p>
-          <w:p>
-            <w:pPr>
-              <w:spacing w:after="160" w:line="288" w:lineRule="auto"/>
+                <w:sz w:val="20"/>
+                <w:szCs w:val="20"/>
+              </w:rPr>
+              <w:t xml:space="preserve">  Neue Anforderungen mit der SFO abgleichen, betroffene Dokumente benennen.</w:t>
+            </w:r>
+          </w:p>
+          <w:p>
+            <w:pPr>
+              <w:spacing w:after="120" w:line="276" w:lineRule="auto"/>
             </w:pPr>
             <w:r>
               <w:rPr>
@@ -204,10 +204,10 @@
             </w:r>
             <w:r>
               <w:rPr>
-                <w:sz w:val="21"/>
-                <w:szCs w:val="21"/>
-              </w:rPr>
-              <w:t xml:space="preserve">  Revisionsberichte aus Prüfungsunterlagen entwerfen, jede Aussage belegt.</w:t>
+                <w:sz w:val="20"/>
+                <w:szCs w:val="20"/>
+              </w:rPr>
+              <w:t xml:space="preserve">  Feststellungen und Berichte aus Prüfungsunterlagen entwerfen, mit Nachweis je Aussage.</w:t>
             </w:r>
           </w:p>
         </w:tc>
@@ -240,7 +240,7 @@
           </w:p>
           <w:p>
             <w:pPr>
-              <w:spacing w:after="160" w:line="288" w:lineRule="auto"/>
+              <w:spacing w:after="120" w:line="276" w:lineRule="auto"/>
             </w:pPr>
             <w:r>
               <w:rPr>
@@ -262,15 +262,15 @@
             </w:r>
             <w:r>
               <w:rPr>
-                <w:sz w:val="21"/>
-                <w:szCs w:val="21"/>
-              </w:rPr>
-              <w:t xml:space="preserve">  Laufend wissen, welche Anwendung veraltet und angreifbar ist.</w:t>
-            </w:r>
-          </w:p>
-          <w:p>
-            <w:pPr>
-              <w:spacing w:after="160" w:line="288" w:lineRule="auto"/>
+                <w:sz w:val="20"/>
+                <w:szCs w:val="20"/>
+              </w:rPr>
+              <w:t xml:space="preserve">  Komponenten, Alter und Schwachstellen je Anwendung laufend erfassen und gezielt testen.</w:t>
+            </w:r>
+          </w:p>
+          <w:p>
+            <w:pPr>
+              <w:spacing w:after="120" w:line="276" w:lineRule="auto"/>
             </w:pPr>
             <w:r>
               <w:rPr>
@@ -292,15 +292,15 @@
             </w:r>
             <w:r>
               <w:rPr>
-                <w:sz w:val="21"/>
-                <w:szCs w:val="21"/>
-              </w:rPr>
-              <w:t xml:space="preserve">  Bei Dienstleistervorfall sofort die betroffenen Prozesse kennen.</w:t>
-            </w:r>
-          </w:p>
-          <w:p>
-            <w:pPr>
-              <w:spacing w:after="160" w:line="288" w:lineRule="auto"/>
+                <w:sz w:val="20"/>
+                <w:szCs w:val="20"/>
+              </w:rPr>
+              <w:t xml:space="preserve">  Abhängigkeiten von Dienstleistern und Subdienstleistern in einem Modell zusammenführen.</w:t>
+            </w:r>
+          </w:p>
+          <w:p>
+            <w:pPr>
+              <w:spacing w:after="120" w:line="276" w:lineRule="auto"/>
             </w:pPr>
             <w:r>
               <w:rPr>
@@ -322,15 +322,15 @@
             </w:r>
             <w:r>
               <w:rPr>
-                <w:sz w:val="21"/>
-                <w:szCs w:val="21"/>
-              </w:rPr>
-              <w:t xml:space="preserve">  IKS-Abweichungen erkennen, wenn sie entstehen.</w:t>
-            </w:r>
-          </w:p>
-          <w:p>
-            <w:pPr>
-              <w:spacing w:after="160" w:line="288" w:lineRule="auto"/>
+                <w:sz w:val="20"/>
+                <w:szCs w:val="20"/>
+              </w:rPr>
+              <w:t xml:space="preserve">  Kontrollabweichungen laufend aus Prozessdaten erkennen.</w:t>
+            </w:r>
+          </w:p>
+          <w:p>
+            <w:pPr>
+              <w:spacing w:after="120" w:line="276" w:lineRule="auto"/>
             </w:pPr>
             <w:r>
               <w:rPr>
@@ -352,10 +352,10 @@
             </w:r>
             <w:r>
               <w:rPr>
-                <w:sz w:val="21"/>
-                <w:szCs w:val="21"/>
-              </w:rPr>
-              <w:t xml:space="preserve">  Warnsignale im 88,9-Mrd.-Portfolio früher bündeln.</w:t>
+                <w:sz w:val="20"/>
+                <w:szCs w:val="20"/>
+              </w:rPr>
+              <w:t xml:space="preserve">  Verteilte Risikosignale je Finanzierung zusammenführen.</w:t>
             </w:r>
           </w:p>
         </w:tc>
@@ -388,7 +388,7 @@
           </w:p>
           <w:p>
             <w:pPr>
-              <w:spacing w:after="160" w:line="288" w:lineRule="auto"/>
+              <w:spacing w:after="120" w:line="276" w:lineRule="auto"/>
             </w:pPr>
             <w:r>
               <w:rPr>
@@ -410,15 +410,15 @@
             </w:r>
             <w:r>
               <w:rPr>
-                <w:sz w:val="21"/>
-                <w:szCs w:val="21"/>
-              </w:rPr>
-              <w:t xml:space="preserve">  Mehr Strukturvarianten je Anfrage, mehr Mandate.</w:t>
-            </w:r>
-          </w:p>
-          <w:p>
-            <w:pPr>
-              <w:spacing w:after="160" w:line="288" w:lineRule="auto"/>
+                <w:sz w:val="20"/>
+                <w:szCs w:val="20"/>
+              </w:rPr>
+              <w:t xml:space="preserve">  Alternative ECA-Strukturen je Anfrage systematisch prüfen.</w:t>
+            </w:r>
+          </w:p>
+          <w:p>
+            <w:pPr>
+              <w:spacing w:after="120" w:line="276" w:lineRule="auto"/>
             </w:pPr>
             <w:r>
               <w:rPr>
@@ -440,10 +440,10 @@
             </w:r>
             <w:r>
               <w:rPr>
-                <w:sz w:val="21"/>
-                <w:szCs w:val="21"/>
-              </w:rPr>
-              <w:t xml:space="preserve">  Risiken intelligenter verteilen, weniger Kapital binden.</w:t>
+                <w:sz w:val="20"/>
+                <w:szCs w:val="20"/>
+              </w:rPr>
+              <w:t xml:space="preserve">  Konsortialpartner und Strukturen aus historischen Transaktionen ableiten.</w:t>
             </w:r>
           </w:p>
         </w:tc>
@@ -495,7 +495,7 @@
           <w:sz w:val="28"/>
           <w:szCs w:val="28"/>
         </w:rPr>
-        <w:t xml:space="preserve">Eine neue EBA-Leitlinie erscheint. Noch am selben Tag liegt auf dem Tisch, welche SFO-Dokumente sich ändern müssen.</w:t>
+        <w:t xml:space="preserve">Neue regulatorische Anforderungen systematisch auf die schriftlich fixierte Ordnung abbilden.</w:t>
       </w:r>
     </w:p>
     <w:tbl>
@@ -554,26 +554,26 @@
           </w:p>
           <w:p>
             <w:pPr>
-              <w:spacing w:after="140" w:before="0" w:line="300" w:lineRule="auto"/>
-            </w:pPr>
-            <w:r>
-              <w:rPr>
-                <w:sz w:val="23"/>
-                <w:szCs w:val="23"/>
-              </w:rPr>
-              <w:t xml:space="preserve">Die KfW muss jede neue Vorgabe von EU, EBA, EZB und BaFin bewerten: Gilt sie für uns, für welche Konzerngesellschaft, ab wann?</w:t>
-            </w:r>
-          </w:p>
-          <w:p>
-            <w:pPr>
-              <w:spacing w:after="140" w:before="0" w:line="300" w:lineRule="auto"/>
-            </w:pPr>
-            <w:r>
-              <w:rPr>
-                <w:sz w:val="23"/>
-                <w:szCs w:val="23"/>
-              </w:rPr>
-              <w:t xml:space="preserve">Das interne Regelwerk ist die schriftlich fixierte Ordnung (SFO). Sie verbindet konzernweite und geschäftsfeldspezifische Vorgaben.</w:t>
+              <w:spacing w:after="120" w:before="0" w:line="288" w:lineRule="auto"/>
+            </w:pPr>
+            <w:r>
+              <w:rPr>
+                <w:sz w:val="22"/>
+                <w:szCs w:val="22"/>
+              </w:rPr>
+              <w:t xml:space="preserve">Die KfW bewertet laufend neue Vorgaben von EU, EBA, EZB und BaFin: Anwendbarkeit je Konzerngesellschaft, Zeitpunkt, Umsetzungsbedarf.</w:t>
+            </w:r>
+          </w:p>
+          <w:p>
+            <w:pPr>
+              <w:spacing w:after="120" w:before="0" w:line="288" w:lineRule="auto"/>
+            </w:pPr>
+            <w:r>
+              <w:rPr>
+                <w:sz w:val="22"/>
+                <w:szCs w:val="22"/>
+              </w:rPr>
+              <w:t xml:space="preserve">Das interne Regelwerk ist die schriftlich fixierte Ordnung (SFO) mit konzernweiten und geschäftsfeldspezifischen Vorgaben.</w:t>
             </w:r>
           </w:p>
         </w:tc>
@@ -611,26 +611,26 @@
           </w:p>
           <w:p>
             <w:pPr>
-              <w:spacing w:after="140" w:before="0" w:line="300" w:lineRule="auto"/>
-            </w:pPr>
-            <w:r>
-              <w:rPr>
-                <w:sz w:val="23"/>
-                <w:szCs w:val="23"/>
-              </w:rPr>
-              <w:t xml:space="preserve">Die Veröffentlichung zu finden ist einfach. Aufwendig ist der Abgleich: Eine einzelne Änderung kann Dutzende SFO-Dokumente berühren.</w:t>
-            </w:r>
-          </w:p>
-          <w:p>
-            <w:pPr>
-              <w:spacing w:after="140" w:before="0" w:line="300" w:lineRule="auto"/>
-            </w:pPr>
-            <w:r>
-              <w:rPr>
-                <w:sz w:val="23"/>
-                <w:szCs w:val="23"/>
-              </w:rPr>
-              <w:t xml:space="preserve">Heute lesen Fachleute Seite für Seite, markieren Stellen von Hand und dokumentieren die Betroffenheit nachvollziehbar für Prüfung und Aufsicht.</w:t>
+              <w:spacing w:after="120" w:before="0" w:line="288" w:lineRule="auto"/>
+            </w:pPr>
+            <w:r>
+              <w:rPr>
+                <w:sz w:val="22"/>
+                <w:szCs w:val="22"/>
+              </w:rPr>
+              <w:t xml:space="preserve">Der Aufwand liegt nicht im Auffinden der Veröffentlichung, sondern im Abgleich: Eine Änderung kann viele SFO-Dokumente betreffen, die einzeln geprüft werden müssen.</w:t>
+            </w:r>
+          </w:p>
+          <w:p>
+            <w:pPr>
+              <w:spacing w:after="120" w:before="0" w:line="288" w:lineRule="auto"/>
+            </w:pPr>
+            <w:r>
+              <w:rPr>
+                <w:sz w:val="22"/>
+                <w:szCs w:val="22"/>
+              </w:rPr>
+              <w:t xml:space="preserve">Die Betroffenheitsanalyse muss für Revision und Aufsicht nachvollziehbar dokumentiert sein. Das bindet erfahrene Fachleute über Wochen.</w:t>
             </w:r>
           </w:p>
         </w:tc>
@@ -668,38 +668,38 @@
           </w:p>
           <w:p>
             <w:pPr>
-              <w:spacing w:after="140" w:before="0" w:line="300" w:lineRule="auto"/>
-            </w:pPr>
-            <w:r>
-              <w:rPr>
-                <w:sz w:val="23"/>
-                <w:szCs w:val="23"/>
-              </w:rPr>
-              <w:t xml:space="preserve">Das System liest Veröffentlichungen laufend ein und unterscheidet Konsultation, final und anwendbar ab.</w:t>
-            </w:r>
-          </w:p>
-          <w:p>
-            <w:pPr>
-              <w:spacing w:after="140" w:before="0" w:line="300" w:lineRule="auto"/>
-            </w:pPr>
-            <w:r>
-              <w:rPr>
-                <w:sz w:val="23"/>
-                <w:szCs w:val="23"/>
-              </w:rPr>
-              <w:t xml:space="preserve">Es gleicht neue Anforderungen mit der SFO ab, markiert betroffene Passagen und schlägt den Änderungstext vor, mit Quellenverweis auf jede Stelle.</w:t>
-            </w:r>
-          </w:p>
-          <w:p>
-            <w:pPr>
-              <w:spacing w:after="140" w:before="0" w:line="300" w:lineRule="auto"/>
-            </w:pPr>
-            <w:r>
-              <w:rPr>
-                <w:sz w:val="23"/>
-                <w:szCs w:val="23"/>
-              </w:rPr>
-              <w:t xml:space="preserve">Compliance prüft, korrigiert, gibt frei.</w:t>
+              <w:spacing w:after="120" w:before="0" w:line="288" w:lineRule="auto"/>
+            </w:pPr>
+            <w:r>
+              <w:rPr>
+                <w:sz w:val="22"/>
+                <w:szCs w:val="22"/>
+              </w:rPr>
+              <w:t xml:space="preserve">Das System erfasst Veröffentlichungen laufend und ordnet ihren Status ein: Konsultation, final, anwendbar ab.</w:t>
+            </w:r>
+          </w:p>
+          <w:p>
+            <w:pPr>
+              <w:spacing w:after="120" w:before="0" w:line="288" w:lineRule="auto"/>
+            </w:pPr>
+            <w:r>
+              <w:rPr>
+                <w:sz w:val="22"/>
+                <w:szCs w:val="22"/>
+              </w:rPr>
+              <w:t xml:space="preserve">Es gleicht die Anforderungen mit der SFO ab, markiert betroffene Passagen und schlägt Änderungstexte vor. Jede Stelle trägt den Verweis auf die Quelle.</w:t>
+            </w:r>
+          </w:p>
+          <w:p>
+            <w:pPr>
+              <w:spacing w:after="120" w:before="0" w:line="288" w:lineRule="auto"/>
+            </w:pPr>
+            <w:r>
+              <w:rPr>
+                <w:sz w:val="22"/>
+                <w:szCs w:val="22"/>
+              </w:rPr>
+              <w:t xml:space="preserve">Die fachliche Bewertung und Freigabe bleibt bei Compliance.</w:t>
             </w:r>
           </w:p>
         </w:tc>
@@ -707,7 +707,7 @@
     </w:tbl>
     <w:p>
       <w:pPr>
-        <w:spacing w:after="320"/>
+        <w:spacing w:after="200"/>
       </w:pPr>
     </w:p>
     <w:p>
@@ -753,9 +753,9 @@
             <w:tcW w:type="dxa" w:w="4856"/>
             <w:shd w:fill="F4F5F8" w:color="auto" w:val="clear"/>
             <w:tcMar>
-              <w:top w:type="dxa" w:w="220"/>
+              <w:top w:type="dxa" w:w="180"/>
               <w:left w:type="dxa" w:w="240"/>
-              <w:bottom w:type="dxa" w:w="220"/>
+              <w:bottom w:type="dxa" w:w="180"/>
               <w:right w:type="dxa" w:w="240"/>
             </w:tcMar>
           </w:tcPr>
@@ -767,10 +767,10 @@
               <w:rPr>
                 <w:rFonts w:ascii="Cambria" w:cs="Cambria" w:eastAsia="Cambria" w:hAnsi="Cambria"/>
                 <w:color w:val="050A30"/>
-                <w:sz w:val="38"/>
-                <w:szCs w:val="38"/>
-              </w:rPr>
-              <w:t xml:space="preserve">Tage statt Wochen</w:t>
+                <w:sz w:val="34"/>
+                <w:szCs w:val="34"/>
+              </w:rPr>
+              <w:t xml:space="preserve">Kürzere Durchlaufzeit</w:t>
             </w:r>
           </w:p>
           <w:p>
@@ -783,7 +783,7 @@
                 <w:sz w:val="20"/>
                 <w:szCs w:val="20"/>
               </w:rPr>
-              <w:t xml:space="preserve">von der Veröffentlichung zur dokumentierten Betroffenheitsanalyse</w:t>
+              <w:t xml:space="preserve">von der Veröffentlichung bis zur dokumentierten Betroffenheitsanalyse</w:t>
             </w:r>
           </w:p>
         </w:tc>
@@ -792,9 +792,9 @@
             <w:tcW w:type="dxa" w:w="4856"/>
             <w:shd w:fill="F4F5F8" w:color="auto" w:val="clear"/>
             <w:tcMar>
-              <w:top w:type="dxa" w:w="220"/>
+              <w:top w:type="dxa" w:w="180"/>
               <w:left w:type="dxa" w:w="240"/>
-              <w:bottom w:type="dxa" w:w="220"/>
+              <w:bottom w:type="dxa" w:w="180"/>
               <w:right w:type="dxa" w:w="240"/>
             </w:tcMar>
           </w:tcPr>
@@ -806,10 +806,10 @@
               <w:rPr>
                 <w:rFonts w:ascii="Cambria" w:cs="Cambria" w:eastAsia="Cambria" w:hAnsi="Cambria"/>
                 <w:color w:val="050A30"/>
-                <w:sz w:val="38"/>
-                <w:szCs w:val="38"/>
-              </w:rPr>
-              <w:t xml:space="preserve">Vollständig</w:t>
+                <w:sz w:val="34"/>
+                <w:szCs w:val="34"/>
+              </w:rPr>
+              <w:t xml:space="preserve">Vollständiger Abgleich</w:t>
             </w:r>
           </w:p>
           <w:p>
@@ -822,7 +822,7 @@
                 <w:sz w:val="20"/>
                 <w:szCs w:val="20"/>
               </w:rPr>
-              <w:t xml:space="preserve">kein betroffenes Dokument wird übersehen, jede Aussage belegt</w:t>
+              <w:t xml:space="preserve">alle betroffenen SFO-Dokumente mit Quellenverweis</w:t>
             </w:r>
           </w:p>
         </w:tc>
@@ -831,9 +831,9 @@
             <w:tcW w:type="dxa" w:w="4858"/>
             <w:shd w:fill="F4F5F8" w:color="auto" w:val="clear"/>
             <w:tcMar>
-              <w:top w:type="dxa" w:w="220"/>
+              <w:top w:type="dxa" w:w="180"/>
               <w:left w:type="dxa" w:w="240"/>
-              <w:bottom w:type="dxa" w:w="220"/>
+              <w:bottom w:type="dxa" w:w="180"/>
               <w:right w:type="dxa" w:w="240"/>
             </w:tcMar>
           </w:tcPr>
@@ -845,10 +845,10 @@
               <w:rPr>
                 <w:rFonts w:ascii="Cambria" w:cs="Cambria" w:eastAsia="Cambria" w:hAnsi="Cambria"/>
                 <w:color w:val="050A30"/>
-                <w:sz w:val="38"/>
-                <w:szCs w:val="38"/>
-              </w:rPr>
-              <w:t xml:space="preserve">Entlastung</w:t>
+                <w:sz w:val="34"/>
+                <w:szCs w:val="34"/>
+              </w:rPr>
+              <w:t xml:space="preserve">Geringerer Abstimmungsaufwand</w:t>
             </w:r>
           </w:p>
           <w:p>
@@ -861,7 +861,7 @@
                 <w:sz w:val="20"/>
                 <w:szCs w:val="20"/>
               </w:rPr>
-              <w:t xml:space="preserve">Fachbereiche prüfen Vorschläge statt Rohtexte</w:t>
+              <w:t xml:space="preserve">Fachbereiche prüfen konkrete Vorschläge statt Rohtexte</w:t>
             </w:r>
           </w:p>
         </w:tc>
@@ -877,7 +877,7 @@
           <w:sz w:val="17"/>
           <w:szCs w:val="17"/>
         </w:rPr>
-        <w:t xml:space="preserve">Testfall: EBA-Leitlinien zu Drittparteienrisiken, final seit 18.09.2026, noch nicht anwendbar. Das System muss genau das erkennen.</w:t>
+        <w:t xml:space="preserve">Beispiel: EBA-Leitlinien zum Drittparteienrisikomanagement, finalisiert am 18.09.2026, noch nicht anwendbar. Das System muss diesen Status korrekt erkennen.</w:t>
       </w:r>
     </w:p>
     <w:p>
@@ -926,7 +926,7 @@
           <w:sz w:val="28"/>
           <w:szCs w:val="28"/>
         </w:rPr>
-        <w:t xml:space="preserve">Die Prüfung ist abgeschlossen. Der Berichtsentwurf steht am nächsten Morgen, jede Feststellung mit Nachweis.</w:t>
+        <w:t xml:space="preserve">Prüfungsfeststellungen und Berichte aus den Prüfungsunterlagen entwerfen, mit Nachweis für jede Aussage.</w:t>
       </w:r>
     </w:p>
     <w:tbl>
@@ -985,26 +985,26 @@
           </w:p>
           <w:p>
             <w:pPr>
-              <w:spacing w:after="140" w:before="0" w:line="300" w:lineRule="auto"/>
-            </w:pPr>
-            <w:r>
-              <w:rPr>
-                <w:sz w:val="23"/>
-                <w:szCs w:val="23"/>
-              </w:rPr>
-              <w:t xml:space="preserve">Rund 100 Beschäftigte in vier Abteilungen, etwa 60 Prüfungen im Jahr.</w:t>
-            </w:r>
-          </w:p>
-          <w:p>
-            <w:pPr>
-              <w:spacing w:after="140" w:before="0" w:line="300" w:lineRule="auto"/>
-            </w:pPr>
-            <w:r>
-              <w:rPr>
-                <w:sz w:val="23"/>
-                <w:szCs w:val="23"/>
-              </w:rPr>
-              <w:t xml:space="preserve">Jeder Bericht muss belastbar, nachvollziehbar und für Vorstand und Aufsicht lesbar sein.</w:t>
+              <w:spacing w:after="120" w:before="0" w:line="288" w:lineRule="auto"/>
+            </w:pPr>
+            <w:r>
+              <w:rPr>
+                <w:sz w:val="22"/>
+                <w:szCs w:val="22"/>
+              </w:rPr>
+              <w:t xml:space="preserve">Die Konzernrevision arbeitet mit rund 100 Beschäftigten in vier Abteilungen und führt etwa 60 Prüfungen im Jahr durch.</w:t>
+            </w:r>
+          </w:p>
+          <w:p>
+            <w:pPr>
+              <w:spacing w:after="120" w:before="0" w:line="288" w:lineRule="auto"/>
+            </w:pPr>
+            <w:r>
+              <w:rPr>
+                <w:sz w:val="22"/>
+                <w:szCs w:val="22"/>
+              </w:rPr>
+              <w:t xml:space="preserve">Jeder Bericht muss belastbar, nachvollziehbar und für Vorstand und Aufsicht adressatengerecht sein.</w:t>
             </w:r>
           </w:p>
         </w:tc>
@@ -1042,26 +1042,26 @@
           </w:p>
           <w:p>
             <w:pPr>
-              <w:spacing w:after="140" w:before="0" w:line="300" w:lineRule="auto"/>
-            </w:pPr>
-            <w:r>
-              <w:rPr>
-                <w:sz w:val="23"/>
-                <w:szCs w:val="23"/>
-              </w:rPr>
-              <w:t xml:space="preserve">Nach der Prüfung beginnt der zweite Teil der Arbeit: Interviewprotokolle ordnen, Nachweise zuordnen, Feststellungen formulieren, Abstimmungsschleifen.</w:t>
-            </w:r>
-          </w:p>
-          <w:p>
-            <w:pPr>
-              <w:spacing w:after="140" w:before="0" w:line="300" w:lineRule="auto"/>
-            </w:pPr>
-            <w:r>
-              <w:rPr>
-                <w:sz w:val="23"/>
-                <w:szCs w:val="23"/>
-              </w:rPr>
-              <w:t xml:space="preserve">Diese Stunden fehlen für das, was die Revision eigentlich ausmacht: das Urteil über das Risiko.</w:t>
+              <w:spacing w:after="120" w:before="0" w:line="288" w:lineRule="auto"/>
+            </w:pPr>
+            <w:r>
+              <w:rPr>
+                <w:sz w:val="22"/>
+                <w:szCs w:val="22"/>
+              </w:rPr>
+              <w:t xml:space="preserve">Nach den Prüfungshandlungen folgt die Dokumentation: Interviewprotokolle strukturieren, Nachweise zuordnen, Feststellungen formulieren, Abstimmungsschleifen.</w:t>
+            </w:r>
+          </w:p>
+          <w:p>
+            <w:pPr>
+              <w:spacing w:after="120" w:before="0" w:line="288" w:lineRule="auto"/>
+            </w:pPr>
+            <w:r>
+              <w:rPr>
+                <w:sz w:val="22"/>
+                <w:szCs w:val="22"/>
+              </w:rPr>
+              <w:t xml:space="preserve">Dieser Anteil der Arbeitszeit steht nicht für die Risikobewertung und die fachliche Vertiefung zur Verfügung.</w:t>
             </w:r>
           </w:p>
         </w:tc>
@@ -1099,38 +1099,38 @@
           </w:p>
           <w:p>
             <w:pPr>
-              <w:spacing w:after="140" w:before="0" w:line="300" w:lineRule="auto"/>
-            </w:pPr>
-            <w:r>
-              <w:rPr>
-                <w:sz w:val="23"/>
-                <w:szCs w:val="23"/>
-              </w:rPr>
-              <w:t xml:space="preserve">Das System verbindet Prüfprogramm, Richtlinien, Nachweise, Protokolle und Testergebnisse.</w:t>
-            </w:r>
-          </w:p>
-          <w:p>
-            <w:pPr>
-              <w:spacing w:after="140" w:before="0" w:line="300" w:lineRule="auto"/>
-            </w:pPr>
-            <w:r>
-              <w:rPr>
-                <w:sz w:val="23"/>
-                <w:szCs w:val="23"/>
-              </w:rPr>
-              <w:t xml:space="preserve">Daraus entstehen Feststellungen und Berichtsentwurf. Jede Aussage verweist auf ihren Nachweis; unbelegte Aussagen und Widersprüche werden markiert.</w:t>
-            </w:r>
-          </w:p>
-          <w:p>
-            <w:pPr>
-              <w:spacing w:after="140" w:before="0" w:line="300" w:lineRule="auto"/>
-            </w:pPr>
-            <w:r>
-              <w:rPr>
-                <w:sz w:val="23"/>
-                <w:szCs w:val="23"/>
-              </w:rPr>
-              <w:t xml:space="preserve">Die Revisorin bewertet, schärft und gibt frei.</w:t>
+              <w:spacing w:after="120" w:before="0" w:line="288" w:lineRule="auto"/>
+            </w:pPr>
+            <w:r>
+              <w:rPr>
+                <w:sz w:val="22"/>
+                <w:szCs w:val="22"/>
+              </w:rPr>
+              <w:t xml:space="preserve">Das System verknüpft Prüfprogramm, einschlägige Richtlinien, Nachweise, Protokolle und Testergebnisse.</w:t>
+            </w:r>
+          </w:p>
+          <w:p>
+            <w:pPr>
+              <w:spacing w:after="120" w:before="0" w:line="288" w:lineRule="auto"/>
+            </w:pPr>
+            <w:r>
+              <w:rPr>
+                <w:sz w:val="22"/>
+                <w:szCs w:val="22"/>
+              </w:rPr>
+              <w:t xml:space="preserve">Daraus entstehen Entwürfe für Feststellungen und Bericht. Jede Aussage verweist auf ihren Nachweis; unbelegte Aussagen und Widersprüche werden gekennzeichnet.</w:t>
+            </w:r>
+          </w:p>
+          <w:p>
+            <w:pPr>
+              <w:spacing w:after="120" w:before="0" w:line="288" w:lineRule="auto"/>
+            </w:pPr>
+            <w:r>
+              <w:rPr>
+                <w:sz w:val="22"/>
+                <w:szCs w:val="22"/>
+              </w:rPr>
+              <w:t xml:space="preserve">Bewertung, Formulierung der Schlussfolgerungen und Freigabe bleiben bei den Revisorinnen und Revisoren.</w:t>
             </w:r>
           </w:p>
         </w:tc>
@@ -1138,7 +1138,7 @@
     </w:tbl>
     <w:p>
       <w:pPr>
-        <w:spacing w:after="320"/>
+        <w:spacing w:after="200"/>
       </w:pPr>
     </w:p>
     <w:p>
@@ -1184,9 +1184,9 @@
             <w:tcW w:type="dxa" w:w="4856"/>
             <w:shd w:fill="F4F5F8" w:color="auto" w:val="clear"/>
             <w:tcMar>
-              <w:top w:type="dxa" w:w="220"/>
+              <w:top w:type="dxa" w:w="180"/>
               <w:left w:type="dxa" w:w="240"/>
-              <w:bottom w:type="dxa" w:w="220"/>
+              <w:bottom w:type="dxa" w:w="180"/>
               <w:right w:type="dxa" w:w="240"/>
             </w:tcMar>
           </w:tcPr>
@@ -1198,10 +1198,10 @@
               <w:rPr>
                 <w:rFonts w:ascii="Cambria" w:cs="Cambria" w:eastAsia="Cambria" w:hAnsi="Cambria"/>
                 <w:color w:val="050A30"/>
-                <w:sz w:val="38"/>
-                <w:szCs w:val="38"/>
-              </w:rPr>
-              <w:t xml:space="preserve">1.200 Stunden</w:t>
+                <w:sz w:val="34"/>
+                <w:szCs w:val="34"/>
+              </w:rPr>
+              <w:t xml:space="preserve">Weniger Dokumentationsaufwand</w:t>
             </w:r>
           </w:p>
           <w:p>
@@ -1214,7 +1214,7 @@
                 <w:sz w:val="20"/>
                 <w:szCs w:val="20"/>
               </w:rPr>
-              <w:t xml:space="preserve">pro Jahr bei 20 Stunden Ersparnis je Bericht (Annahme)</w:t>
+              <w:t xml:space="preserve">bei 20 Stunden je Bericht rund 1.200 Stunden im Jahr (Annahme)</w:t>
             </w:r>
           </w:p>
         </w:tc>
@@ -1223,9 +1223,9 @@
             <w:tcW w:type="dxa" w:w="4856"/>
             <w:shd w:fill="F4F5F8" w:color="auto" w:val="clear"/>
             <w:tcMar>
-              <w:top w:type="dxa" w:w="220"/>
+              <w:top w:type="dxa" w:w="180"/>
               <w:left w:type="dxa" w:w="240"/>
-              <w:bottom w:type="dxa" w:w="220"/>
+              <w:bottom w:type="dxa" w:w="180"/>
               <w:right w:type="dxa" w:w="240"/>
             </w:tcMar>
           </w:tcPr>
@@ -1237,10 +1237,10 @@
               <w:rPr>
                 <w:rFonts w:ascii="Cambria" w:cs="Cambria" w:eastAsia="Cambria" w:hAnsi="Cambria"/>
                 <w:color w:val="050A30"/>
-                <w:sz w:val="38"/>
-                <w:szCs w:val="38"/>
-              </w:rPr>
-              <w:t xml:space="preserve">Einheitlich</w:t>
+                <w:sz w:val="34"/>
+                <w:szCs w:val="34"/>
+              </w:rPr>
+              <w:t xml:space="preserve">Einheitliche Berichte</w:t>
             </w:r>
           </w:p>
           <w:p>
@@ -1253,7 +1253,7 @@
                 <w:sz w:val="20"/>
                 <w:szCs w:val="20"/>
               </w:rPr>
-              <w:t xml:space="preserve">gleiche Struktur und Nachweistiefe über alle 60 Berichte</w:t>
+              <w:t xml:space="preserve">gleiche Struktur und Nachweistiefe über alle Prüfungen</w:t>
             </w:r>
           </w:p>
         </w:tc>
@@ -1262,9 +1262,9 @@
             <w:tcW w:type="dxa" w:w="4858"/>
             <w:shd w:fill="F4F5F8" w:color="auto" w:val="clear"/>
             <w:tcMar>
-              <w:top w:type="dxa" w:w="220"/>
+              <w:top w:type="dxa" w:w="180"/>
               <w:left w:type="dxa" w:w="240"/>
-              <w:bottom w:type="dxa" w:w="220"/>
+              <w:bottom w:type="dxa" w:w="180"/>
               <w:right w:type="dxa" w:w="240"/>
             </w:tcMar>
           </w:tcPr>
@@ -1276,10 +1276,10 @@
               <w:rPr>
                 <w:rFonts w:ascii="Cambria" w:cs="Cambria" w:eastAsia="Cambria" w:hAnsi="Cambria"/>
                 <w:color w:val="050A30"/>
-                <w:sz w:val="38"/>
-                <w:szCs w:val="38"/>
-              </w:rPr>
-              <w:t xml:space="preserve">Mehr Prüfung</w:t>
+                <w:sz w:val="34"/>
+                <w:szCs w:val="34"/>
+              </w:rPr>
+              <w:t xml:space="preserve">Mehr Prüfungskapazität</w:t>
             </w:r>
           </w:p>
           <w:p>
@@ -1292,7 +1292,7 @@
                 <w:sz w:val="20"/>
                 <w:szCs w:val="20"/>
               </w:rPr>
-              <w:t xml:space="preserve">frei werdende Kapazität geht in kritische Themen, nicht in Formulierung</w:t>
+              <w:t xml:space="preserve">frei werdende Zeit für risikoorientierte Prüfungen</w:t>
             </w:r>
           </w:p>
         </w:tc>
@@ -1357,7 +1357,7 @@
           <w:sz w:val="28"/>
           <w:szCs w:val="28"/>
         </w:rPr>
-        <w:t xml:space="preserve">Nicht beim nächsten Pentest erfahren, wo es brennt, sondern jeden Tag wissen, welche Anwendung als nächstes dran ist.</w:t>
+        <w:t xml:space="preserve">Kontinuierlich wissen, welche Anwendungen veraltete oder angreifbare Komponenten enthalten, und dort gezielt testen.</w:t>
       </w:r>
     </w:p>
     <w:tbl>
@@ -1416,26 +1416,26 @@
           </w:p>
           <w:p>
             <w:pPr>
-              <w:spacing w:after="140" w:before="0" w:line="300" w:lineRule="auto"/>
-            </w:pPr>
-            <w:r>
-              <w:rPr>
-                <w:sz w:val="23"/>
-                <w:szCs w:val="23"/>
-              </w:rPr>
-              <w:t xml:space="preserve">Der Finanzbericht 2025 nennt Cyberangriffe und fehlerhafte Systemänderungen als zentrale IKT-Risiken. Die EZB setzt Cyberresilienz und Pentests 2026–2028 ganz oben.</w:t>
-            </w:r>
-          </w:p>
-          <w:p>
-            <w:pPr>
-              <w:spacing w:after="140" w:before="0" w:line="300" w:lineRule="auto"/>
-            </w:pPr>
-            <w:r>
-              <w:rPr>
-                <w:sz w:val="23"/>
-                <w:szCs w:val="23"/>
-              </w:rPr>
-              <w:t xml:space="preserve">Die Landschaft: Eigenentwicklungen, Anwendungen mehrerer Generationen, externe Bibliotheken, Schnittstellen.</w:t>
+              <w:spacing w:after="120" w:before="0" w:line="288" w:lineRule="auto"/>
+            </w:pPr>
+            <w:r>
+              <w:rPr>
+                <w:sz w:val="22"/>
+                <w:szCs w:val="22"/>
+              </w:rPr>
+              <w:t xml:space="preserve">Der Finanzbericht 2025 nennt Cyberangriffe und fehlerhafte Systemänderungen als zentrale IKT-Risiken. Die EZB führt Cyberresilienz und Penetrationstests als Aufsichtsschwerpunkt 2026–2028.</w:t>
+            </w:r>
+          </w:p>
+          <w:p>
+            <w:pPr>
+              <w:spacing w:after="120" w:before="0" w:line="288" w:lineRule="auto"/>
+            </w:pPr>
+            <w:r>
+              <w:rPr>
+                <w:sz w:val="22"/>
+                <w:szCs w:val="22"/>
+              </w:rPr>
+              <w:t xml:space="preserve">Die Anwendungslandschaft umfasst Eigenentwicklungen, Systeme mehrerer Generationen, externe Bibliotheken und Schnittstellen.</w:t>
             </w:r>
           </w:p>
         </w:tc>
@@ -1473,26 +1473,26 @@
           </w:p>
           <w:p>
             <w:pPr>
-              <w:spacing w:after="140" w:before="0" w:line="300" w:lineRule="auto"/>
-            </w:pPr>
-            <w:r>
-              <w:rPr>
-                <w:sz w:val="23"/>
-                <w:szCs w:val="23"/>
-              </w:rPr>
-              <w:t xml:space="preserve">Eine Anwendung kann stabil laufen und trotzdem auf einer Bibliothek ohne Herstellersupport sitzen, mit einer Schwachstelle, die bereits aktiv ausgenutzt wird.</w:t>
-            </w:r>
-          </w:p>
-          <w:p>
-            <w:pPr>
-              <w:spacing w:after="140" w:before="0" w:line="300" w:lineRule="auto"/>
-            </w:pPr>
-            <w:r>
-              <w:rPr>
-                <w:sz w:val="23"/>
-                <w:szCs w:val="23"/>
-              </w:rPr>
-              <w:t xml:space="preserve">Pentests zeigen einen Zeitpunkt. Niemand hat eine laufende Antwort auf: Wie alt ist unser produktiver Code? Welche Komponenten sind End-of-Life? Welche davon sind von außen erreichbar?</w:t>
+              <w:spacing w:after="120" w:before="0" w:line="288" w:lineRule="auto"/>
+            </w:pPr>
+            <w:r>
+              <w:rPr>
+                <w:sz w:val="22"/>
+                <w:szCs w:val="22"/>
+              </w:rPr>
+              <w:t xml:space="preserve">Eine Anwendung kann im Betrieb stabil laufen und dennoch Komponenten ohne Herstellersupport oder mit bekannten, aktiv ausgenutzten Schwachstellen enthalten.</w:t>
+            </w:r>
+          </w:p>
+          <w:p>
+            <w:pPr>
+              <w:spacing w:after="120" w:before="0" w:line="288" w:lineRule="auto"/>
+            </w:pPr>
+            <w:r>
+              <w:rPr>
+                <w:sz w:val="22"/>
+                <w:szCs w:val="22"/>
+              </w:rPr>
+              <w:t xml:space="preserve">Penetrationstests liefern ein Bild zu einem Zeitpunkt. Eine laufende Sicht auf Alter, Supportstatus und Erreichbarkeit der Komponenten je Anwendung fehlt häufig.</w:t>
             </w:r>
           </w:p>
         </w:tc>
@@ -1530,38 +1530,38 @@
           </w:p>
           <w:p>
             <w:pPr>
-              <w:spacing w:after="140" w:before="0" w:line="300" w:lineRule="auto"/>
-            </w:pPr>
-            <w:r>
-              <w:rPr>
-                <w:sz w:val="23"/>
-                <w:szCs w:val="23"/>
-              </w:rPr>
-              <w:t xml:space="preserve">Komponenteninventar (SBOM) je Anwendung, Abgleich mit Schwachstellendaten, Supportstatus und dem CISA-Katalog aktiv ausgenutzter Lücken.</w:t>
-            </w:r>
-          </w:p>
-          <w:p>
-            <w:pPr>
-              <w:spacing w:after="140" w:before="0" w:line="300" w:lineRule="auto"/>
-            </w:pPr>
-            <w:r>
-              <w:rPr>
-                <w:sz w:val="23"/>
-                <w:szCs w:val="23"/>
+              <w:spacing w:after="120" w:before="0" w:line="288" w:lineRule="auto"/>
+            </w:pPr>
+            <w:r>
+              <w:rPr>
+                <w:sz w:val="22"/>
+                <w:szCs w:val="22"/>
+              </w:rPr>
+              <w:t xml:space="preserve">Komponenteninventar (SBOM) je Anwendung aus Repositories und Build-Artefakten; Abgleich mit Schwachstellendaten, Supportstatus und dem CISA-Katalog aktiv ausgenutzter Schwachstellen.</w:t>
+            </w:r>
+          </w:p>
+          <w:p>
+            <w:pPr>
+              <w:spacing w:after="120" w:before="0" w:line="288" w:lineRule="auto"/>
+            </w:pPr>
+            <w:r>
+              <w:rPr>
+                <w:sz w:val="22"/>
+                <w:szCs w:val="22"/>
               </w:rPr>
               <w:t xml:space="preserve">Priorisierung nach Erreichbarkeit und Schutzbedarf. Automatisierte Tests in freigegebenen, isolierten Umgebungen; Nachtest nach jeder Behebung.</w:t>
             </w:r>
           </w:p>
           <w:p>
             <w:pPr>
-              <w:spacing w:after="140" w:before="0" w:line="300" w:lineRule="auto"/>
-            </w:pPr>
-            <w:r>
-              <w:rPr>
-                <w:sz w:val="23"/>
-                <w:szCs w:val="23"/>
-              </w:rPr>
-              <w:t xml:space="preserve">Neu: ein Software- und Code-Alters-Report je Anwendung.</w:t>
+              <w:spacing w:after="120" w:before="0" w:line="288" w:lineRule="auto"/>
+            </w:pPr>
+            <w:r>
+              <w:rPr>
+                <w:sz w:val="22"/>
+                <w:szCs w:val="22"/>
+              </w:rPr>
+              <w:t xml:space="preserve">Ergänzend ein Report zu Software- und Code-Alter je Anwendung.</w:t>
             </w:r>
           </w:p>
         </w:tc>
@@ -1569,7 +1569,7 @@
     </w:tbl>
     <w:p>
       <w:pPr>
-        <w:spacing w:after="320"/>
+        <w:spacing w:after="200"/>
       </w:pPr>
     </w:p>
     <w:p>
@@ -1615,9 +1615,9 @@
             <w:tcW w:type="dxa" w:w="4856"/>
             <w:shd w:fill="F4F5F8" w:color="auto" w:val="clear"/>
             <w:tcMar>
-              <w:top w:type="dxa" w:w="220"/>
+              <w:top w:type="dxa" w:w="180"/>
               <w:left w:type="dxa" w:w="240"/>
-              <w:bottom w:type="dxa" w:w="220"/>
+              <w:bottom w:type="dxa" w:w="180"/>
               <w:right w:type="dxa" w:w="240"/>
             </w:tcMar>
           </w:tcPr>
@@ -1629,10 +1629,10 @@
               <w:rPr>
                 <w:rFonts w:ascii="Cambria" w:cs="Cambria" w:eastAsia="Cambria" w:hAnsi="Cambria"/>
                 <w:color w:val="050A30"/>
-                <w:sz w:val="38"/>
-                <w:szCs w:val="38"/>
-              </w:rPr>
-              <w:t xml:space="preserve">Eine Zahl</w:t>
+                <w:sz w:val="34"/>
+                <w:szCs w:val="34"/>
+              </w:rPr>
+              <w:t xml:space="preserve">Transparenz</w:t>
             </w:r>
           </w:p>
           <w:p>
@@ -1645,7 +1645,7 @@
                 <w:sz w:val="20"/>
                 <w:szCs w:val="20"/>
               </w:rPr>
-              <w:t xml:space="preserve">Software-Alter, End-of-Life-Quote und kritische Exposure je Anwendung</w:t>
+              <w:t xml:space="preserve">Software-Alter, End-of-Life-Quote und erreichbare kritische Schwachstellen je Anwendung</w:t>
             </w:r>
           </w:p>
         </w:tc>
@@ -1654,9 +1654,9 @@
             <w:tcW w:type="dxa" w:w="4856"/>
             <w:shd w:fill="F4F5F8" w:color="auto" w:val="clear"/>
             <w:tcMar>
-              <w:top w:type="dxa" w:w="220"/>
+              <w:top w:type="dxa" w:w="180"/>
               <w:left w:type="dxa" w:w="240"/>
-              <w:bottom w:type="dxa" w:w="220"/>
+              <w:bottom w:type="dxa" w:w="180"/>
               <w:right w:type="dxa" w:w="240"/>
             </w:tcMar>
           </w:tcPr>
@@ -1668,10 +1668,10 @@
               <w:rPr>
                 <w:rFonts w:ascii="Cambria" w:cs="Cambria" w:eastAsia="Cambria" w:hAnsi="Cambria"/>
                 <w:color w:val="050A30"/>
-                <w:sz w:val="38"/>
-                <w:szCs w:val="38"/>
-              </w:rPr>
-              <w:t xml:space="preserve">Schneller</w:t>
+                <w:sz w:val="34"/>
+                <w:szCs w:val="34"/>
+              </w:rPr>
+              <w:t xml:space="preserve">Kürzere Remediation Time</w:t>
             </w:r>
           </w:p>
           <w:p>
@@ -1684,7 +1684,7 @@
                 <w:sz w:val="20"/>
                 <w:szCs w:val="20"/>
               </w:rPr>
-              <w:t xml:space="preserve">kürzere Zeit von Erkennung bis verifizierter Behebung</w:t>
+              <w:t xml:space="preserve">von der Erkennung bis zur verifizierten Behebung</w:t>
             </w:r>
           </w:p>
         </w:tc>
@@ -1693,9 +1693,9 @@
             <w:tcW w:type="dxa" w:w="4858"/>
             <w:shd w:fill="F4F5F8" w:color="auto" w:val="clear"/>
             <w:tcMar>
-              <w:top w:type="dxa" w:w="220"/>
+              <w:top w:type="dxa" w:w="180"/>
               <w:left w:type="dxa" w:w="240"/>
-              <w:bottom w:type="dxa" w:w="220"/>
+              <w:bottom w:type="dxa" w:w="180"/>
               <w:right w:type="dxa" w:w="240"/>
             </w:tcMar>
           </w:tcPr>
@@ -1707,10 +1707,10 @@
               <w:rPr>
                 <w:rFonts w:ascii="Cambria" w:cs="Cambria" w:eastAsia="Cambria" w:hAnsi="Cambria"/>
                 <w:color w:val="050A30"/>
-                <w:sz w:val="38"/>
-                <w:szCs w:val="38"/>
-              </w:rPr>
-              <w:t xml:space="preserve">Gezielt</w:t>
+                <w:sz w:val="34"/>
+                <w:szCs w:val="34"/>
+              </w:rPr>
+              <w:t xml:space="preserve">Gezielter Testaufwand</w:t>
             </w:r>
           </w:p>
           <w:p>
@@ -1723,7 +1723,7 @@
                 <w:sz w:val="20"/>
                 <w:szCs w:val="20"/>
               </w:rPr>
-              <w:t xml:space="preserve">Testaufwand dort, wo Alter, Schwachstelle und Erreichbarkeit zusammenkommen</w:t>
+              <w:t xml:space="preserve">auf Anwendungen mit hohem Risiko und hoher Exposition</w:t>
             </w:r>
           </w:p>
         </w:tc>
@@ -1739,7 +1739,7 @@
           <w:sz w:val="17"/>
           <w:szCs w:val="17"/>
         </w:rPr>
-        <w:t xml:space="preserve">Ergänzt manuelle Pentests und bedrohungsorientierte Tests (TLPT) nach DORA, ersetzt sie nicht.</w:t>
+        <w:t xml:space="preserve">Ergänzt manuelle Penetrationstests und bedrohungsorientierte Tests (TLPT) nach DORA, ersetzt sie nicht.</w:t>
       </w:r>
     </w:p>
     <w:p>
@@ -1788,7 +1788,7 @@
           <w:sz w:val="28"/>
           <w:szCs w:val="28"/>
         </w:rPr>
-        <w:t xml:space="preserve">Ein Cloud-Anbieter meldet einen Vorfall. Zehn Minuten später steht fest, welche Geschäftsprozesse der KfW betroffen sein könnten.</w:t>
+        <w:t xml:space="preserve">Abhängigkeiten von Dienstleistern, Subdienstleistern und Systemen in einem Modell zusammenführen.</w:t>
       </w:r>
     </w:p>
     <w:tbl>
@@ -1847,26 +1847,26 @@
           </w:p>
           <w:p>
             <w:pPr>
-              <w:spacing w:after="140" w:before="0" w:line="300" w:lineRule="auto"/>
-            </w:pPr>
-            <w:r>
-              <w:rPr>
-                <w:sz w:val="23"/>
-                <w:szCs w:val="23"/>
-              </w:rPr>
-              <w:t xml:space="preserve">Kritische Prozesse hängen an Cloud-Providern, Softwareherstellern, Rechenzentren und deren Subdienstleistern.</w:t>
-            </w:r>
-          </w:p>
-          <w:p>
-            <w:pPr>
-              <w:spacing w:after="140" w:before="0" w:line="300" w:lineRule="auto"/>
-            </w:pPr>
-            <w:r>
-              <w:rPr>
-                <w:sz w:val="23"/>
-                <w:szCs w:val="23"/>
-              </w:rPr>
-              <w:t xml:space="preserve">DORA verlangt ein strukturiertes Management dieser Abhängigkeiten; die EBA hat im September 2026 Leitlinien auch für Nicht-IKT-Drittparteien finalisiert.</w:t>
+              <w:spacing w:after="120" w:before="0" w:line="288" w:lineRule="auto"/>
+            </w:pPr>
+            <w:r>
+              <w:rPr>
+                <w:sz w:val="22"/>
+                <w:szCs w:val="22"/>
+              </w:rPr>
+              <w:t xml:space="preserve">Kritische Geschäftsprozesse hängen von Cloud-Providern, Softwareherstellern, Rechenzentrumsdiensten und deren Subdienstleistern ab.</w:t>
+            </w:r>
+          </w:p>
+          <w:p>
+            <w:pPr>
+              <w:spacing w:after="120" w:before="0" w:line="288" w:lineRule="auto"/>
+            </w:pPr>
+            <w:r>
+              <w:rPr>
+                <w:sz w:val="22"/>
+                <w:szCs w:val="22"/>
+              </w:rPr>
+              <w:t xml:space="preserve">DORA verlangt ein strukturiertes Management dieser Abhängigkeiten. Die EBA hat im September 2026 Leitlinien auch für Drittparteien außerhalb des IKT-Bereichs finalisiert.</w:t>
             </w:r>
           </w:p>
         </w:tc>
@@ -1904,26 +1904,26 @@
           </w:p>
           <w:p>
             <w:pPr>
-              <w:spacing w:after="140" w:before="0" w:line="300" w:lineRule="auto"/>
-            </w:pPr>
-            <w:r>
-              <w:rPr>
-                <w:sz w:val="23"/>
-                <w:szCs w:val="23"/>
-              </w:rPr>
-              <w:t xml:space="preserve">Hinter einer Anwendung stehen oft mehrere Anbieter und Subunternehmer. Das Wissen darüber liegt verteilt: Vertragsmanagement, IT-Architektur, Prozessdokumentation, Risikomanagement.</w:t>
-            </w:r>
-          </w:p>
-          <w:p>
-            <w:pPr>
-              <w:spacing w:after="140" w:before="0" w:line="300" w:lineRule="auto"/>
-            </w:pPr>
-            <w:r>
-              <w:rPr>
-                <w:sz w:val="23"/>
-                <w:szCs w:val="23"/>
-              </w:rPr>
-              <w:t xml:space="preserve">Bei einem Vorfall beginnt die Suche quer durch diese Systeme.</w:t>
+              <w:spacing w:after="120" w:before="0" w:line="288" w:lineRule="auto"/>
+            </w:pPr>
+            <w:r>
+              <w:rPr>
+                <w:sz w:val="22"/>
+                <w:szCs w:val="22"/>
+              </w:rPr>
+              <w:t xml:space="preserve">Hinter einer Anwendung stehen oft mehrere Anbieter und Subunternehmer. Die Informationen dazu liegen verteilt in Vertragsmanagement, IT-Architektur, Prozessdokumentation und Risikomanagement.</w:t>
+            </w:r>
+          </w:p>
+          <w:p>
+            <w:pPr>
+              <w:spacing w:after="120" w:before="0" w:line="288" w:lineRule="auto"/>
+            </w:pPr>
+            <w:r>
+              <w:rPr>
+                <w:sz w:val="22"/>
+                <w:szCs w:val="22"/>
+              </w:rPr>
+              <w:t xml:space="preserve">Bei einem Dienstleistervorfall muss die Betroffenheit aus diesen Quellen erst zusammengetragen werden.</w:t>
             </w:r>
           </w:p>
         </w:tc>
@@ -1961,38 +1961,38 @@
           </w:p>
           <w:p>
             <w:pPr>
-              <w:spacing w:after="140" w:before="0" w:line="300" w:lineRule="auto"/>
-            </w:pPr>
-            <w:r>
-              <w:rPr>
-                <w:sz w:val="23"/>
-                <w:szCs w:val="23"/>
-              </w:rPr>
-              <w:t xml:space="preserve">Ein Abhängigkeitsmodell verknüpft Verträge, Dienstleister, Subketten, Systeme und Geschäftsprozesse.</w:t>
-            </w:r>
-          </w:p>
-          <w:p>
-            <w:pPr>
-              <w:spacing w:after="140" w:before="0" w:line="300" w:lineRule="auto"/>
-            </w:pPr>
-            <w:r>
-              <w:rPr>
-                <w:sz w:val="23"/>
-                <w:szCs w:val="23"/>
-              </w:rPr>
-              <w:t xml:space="preserve">Auf einen Blick: Welche Funktionen hängen an welchem Anbieter, welche Absicherung besteht, welcher Exit-Plan ist dokumentiert, wo fehlt ein Nachweis.</w:t>
-            </w:r>
-          </w:p>
-          <w:p>
-            <w:pPr>
-              <w:spacing w:after="140" w:before="0" w:line="300" w:lineRule="auto"/>
-            </w:pPr>
-            <w:r>
-              <w:rPr>
-                <w:sz w:val="23"/>
-                <w:szCs w:val="23"/>
-              </w:rPr>
-              <w:t xml:space="preserve">Konzentrationsrisiken werden sichtbar, bevor die Aufsicht danach fragt.</w:t>
+              <w:spacing w:after="120" w:before="0" w:line="288" w:lineRule="auto"/>
+            </w:pPr>
+            <w:r>
+              <w:rPr>
+                <w:sz w:val="22"/>
+                <w:szCs w:val="22"/>
+              </w:rPr>
+              <w:t xml:space="preserve">Ein Abhängigkeitsmodell verknüpft Verträge, Dienstleister, Subdienstleisterketten, Systeme und Geschäftsprozesse.</w:t>
+            </w:r>
+          </w:p>
+          <w:p>
+            <w:pPr>
+              <w:spacing w:after="120" w:before="0" w:line="288" w:lineRule="auto"/>
+            </w:pPr>
+            <w:r>
+              <w:rPr>
+                <w:sz w:val="22"/>
+                <w:szCs w:val="22"/>
+              </w:rPr>
+              <w:t xml:space="preserve">Es zeigt je Dienstleister die abhängigen Funktionen, bestehende vertragliche Absicherungen, dokumentierte Exit- und Wiederanlaufpläne und fehlende Nachweise.</w:t>
+            </w:r>
+          </w:p>
+          <w:p>
+            <w:pPr>
+              <w:spacing w:after="120" w:before="0" w:line="288" w:lineRule="auto"/>
+            </w:pPr>
+            <w:r>
+              <w:rPr>
+                <w:sz w:val="22"/>
+                <w:szCs w:val="22"/>
+              </w:rPr>
+              <w:t xml:space="preserve">Konzentrationsrisiken werden aus den vorhandenen Daten sichtbar.</w:t>
             </w:r>
           </w:p>
         </w:tc>
@@ -2000,7 +2000,7 @@
     </w:tbl>
     <w:p>
       <w:pPr>
-        <w:spacing w:after="320"/>
+        <w:spacing w:after="200"/>
       </w:pPr>
     </w:p>
     <w:p>
@@ -2046,9 +2046,9 @@
             <w:tcW w:type="dxa" w:w="4856"/>
             <w:shd w:fill="F4F5F8" w:color="auto" w:val="clear"/>
             <w:tcMar>
-              <w:top w:type="dxa" w:w="220"/>
+              <w:top w:type="dxa" w:w="180"/>
               <w:left w:type="dxa" w:w="240"/>
-              <w:bottom w:type="dxa" w:w="220"/>
+              <w:bottom w:type="dxa" w:w="180"/>
               <w:right w:type="dxa" w:w="240"/>
             </w:tcMar>
           </w:tcPr>
@@ -2060,10 +2060,10 @@
               <w:rPr>
                 <w:rFonts w:ascii="Cambria" w:cs="Cambria" w:eastAsia="Cambria" w:hAnsi="Cambria"/>
                 <w:color w:val="050A30"/>
-                <w:sz w:val="38"/>
-                <w:szCs w:val="38"/>
-              </w:rPr>
-              <w:t xml:space="preserve">Minuten</w:t>
+                <w:sz w:val="34"/>
+                <w:szCs w:val="34"/>
+              </w:rPr>
+              <w:t xml:space="preserve">Schnellere Betroffenheitsanalyse</w:t>
             </w:r>
           </w:p>
           <w:p>
@@ -2076,7 +2076,7 @@
                 <w:sz w:val="20"/>
                 <w:szCs w:val="20"/>
               </w:rPr>
-              <w:t xml:space="preserve">bis zur Betroffenheitsanalyse bei einem Dienstleistervorfall</w:t>
+              <w:t xml:space="preserve">bei Störungen oder Sicherheitsmeldungen eines Dienstleisters</w:t>
             </w:r>
           </w:p>
         </w:tc>
@@ -2085,9 +2085,9 @@
             <w:tcW w:type="dxa" w:w="4856"/>
             <w:shd w:fill="F4F5F8" w:color="auto" w:val="clear"/>
             <w:tcMar>
-              <w:top w:type="dxa" w:w="220"/>
+              <w:top w:type="dxa" w:w="180"/>
               <w:left w:type="dxa" w:w="240"/>
-              <w:bottom w:type="dxa" w:w="220"/>
+              <w:bottom w:type="dxa" w:w="180"/>
               <w:right w:type="dxa" w:w="240"/>
             </w:tcMar>
           </w:tcPr>
@@ -2099,10 +2099,10 @@
               <w:rPr>
                 <w:rFonts w:ascii="Cambria" w:cs="Cambria" w:eastAsia="Cambria" w:hAnsi="Cambria"/>
                 <w:color w:val="050A30"/>
-                <w:sz w:val="38"/>
-                <w:szCs w:val="38"/>
-              </w:rPr>
-              <w:t xml:space="preserve">Lückenlos</w:t>
+                <w:sz w:val="34"/>
+                <w:szCs w:val="34"/>
+              </w:rPr>
+              <w:t xml:space="preserve">Vollständige Erfassung</w:t>
             </w:r>
           </w:p>
           <w:p>
@@ -2115,7 +2115,7 @@
                 <w:sz w:val="20"/>
                 <w:szCs w:val="20"/>
               </w:rPr>
-              <w:t xml:space="preserve">jede kritische Abhängigkeit erfasst, inklusive Subdienstleister</w:t>
+              <w:t xml:space="preserve">kritischer Abhängigkeiten einschließlich Subdienstleister</w:t>
             </w:r>
           </w:p>
         </w:tc>
@@ -2124,9 +2124,9 @@
             <w:tcW w:type="dxa" w:w="4858"/>
             <w:shd w:fill="F4F5F8" w:color="auto" w:val="clear"/>
             <w:tcMar>
-              <w:top w:type="dxa" w:w="220"/>
+              <w:top w:type="dxa" w:w="180"/>
               <w:left w:type="dxa" w:w="240"/>
-              <w:bottom w:type="dxa" w:w="220"/>
+              <w:bottom w:type="dxa" w:w="180"/>
               <w:right w:type="dxa" w:w="240"/>
             </w:tcMar>
           </w:tcPr>
@@ -2138,10 +2138,10 @@
               <w:rPr>
                 <w:rFonts w:ascii="Cambria" w:cs="Cambria" w:eastAsia="Cambria" w:hAnsi="Cambria"/>
                 <w:color w:val="050A30"/>
-                <w:sz w:val="38"/>
-                <w:szCs w:val="38"/>
-              </w:rPr>
-              <w:t xml:space="preserve">Belegbar</w:t>
+                <w:sz w:val="34"/>
+                <w:szCs w:val="34"/>
+              </w:rPr>
+              <w:t xml:space="preserve">Prüfbare Nachweise</w:t>
             </w:r>
           </w:p>
           <w:p>
@@ -2154,7 +2154,7 @@
                 <w:sz w:val="20"/>
                 <w:szCs w:val="20"/>
               </w:rPr>
-              <w:t xml:space="preserve">Exit-Pläne und Nachweise direkt am Prozess, prüfbar für DORA</w:t>
+              <w:t xml:space="preserve">Exit-Pläne und Absicherungen direkt am Geschäftsprozess</w:t>
             </w:r>
           </w:p>
         </w:tc>
@@ -2207,7 +2207,7 @@
           <w:sz w:val="28"/>
           <w:szCs w:val="28"/>
         </w:rPr>
-        <w:t xml:space="preserve">Eine Berechtigung wird ohne Freigabe erweitert. Die Kontrollverantwortliche weiß es noch am selben Tag, nicht erst bei der nächsten Prüfung.</w:t>
+        <w:t xml:space="preserve">Kontrollabweichungen laufend aus Prozessdaten erkennen statt nur zu festen Prüfzeitpunkten.</w:t>
       </w:r>
     </w:p>
     <w:tbl>
@@ -2266,26 +2266,26 @@
           </w:p>
           <w:p>
             <w:pPr>
-              <w:spacing w:after="140" w:before="0" w:line="300" w:lineRule="auto"/>
-            </w:pPr>
-            <w:r>
-              <w:rPr>
-                <w:sz w:val="23"/>
-                <w:szCs w:val="23"/>
-              </w:rPr>
-              <w:t xml:space="preserve">Die KfW hat etablierte IKS-Kontrollen, Risiko-Assessments und OpRisk-Dashboards.</w:t>
-            </w:r>
-          </w:p>
-          <w:p>
-            <w:pPr>
-              <w:spacing w:after="140" w:before="0" w:line="300" w:lineRule="auto"/>
-            </w:pPr>
-            <w:r>
-              <w:rPr>
-                <w:sz w:val="23"/>
-                <w:szCs w:val="23"/>
-              </w:rPr>
-              <w:t xml:space="preserve">Kontrollen werden in festen Abständen geprüft, Nachweise zusammengetragen, Maßnahmen nachverfolgt.</w:t>
+              <w:spacing w:after="120" w:before="0" w:line="288" w:lineRule="auto"/>
+            </w:pPr>
+            <w:r>
+              <w:rPr>
+                <w:sz w:val="22"/>
+                <w:szCs w:val="22"/>
+              </w:rPr>
+              <w:t xml:space="preserve">Die KfW verfügt über etablierte IKS-Kontrollen, regelmäßige Risiko-Assessments und bereichsspezifische OpRisk-Dashboards.</w:t>
+            </w:r>
+          </w:p>
+          <w:p>
+            <w:pPr>
+              <w:spacing w:after="120" w:before="0" w:line="288" w:lineRule="auto"/>
+            </w:pPr>
+            <w:r>
+              <w:rPr>
+                <w:sz w:val="22"/>
+                <w:szCs w:val="22"/>
+              </w:rPr>
+              <w:t xml:space="preserve">Kontrollen werden in festen Abständen geprüft, Nachweise zusammengetragen und Maßnahmen nachverfolgt.</w:t>
             </w:r>
           </w:p>
         </w:tc>
@@ -2323,26 +2323,26 @@
           </w:p>
           <w:p>
             <w:pPr>
-              <w:spacing w:after="140" w:before="0" w:line="300" w:lineRule="auto"/>
-            </w:pPr>
-            <w:r>
-              <w:rPr>
-                <w:sz w:val="23"/>
-                <w:szCs w:val="23"/>
-              </w:rPr>
-              <w:t xml:space="preserve">Zwischen zwei Prüfzeitpunkten entstehen Abweichungen, die erst Monate später auffallen.</w:t>
-            </w:r>
-          </w:p>
-          <w:p>
-            <w:pPr>
-              <w:spacing w:after="140" w:before="0" w:line="300" w:lineRule="auto"/>
-            </w:pPr>
-            <w:r>
-              <w:rPr>
-                <w:sz w:val="23"/>
-                <w:szCs w:val="23"/>
-              </w:rPr>
-              <w:t xml:space="preserve">Kontrollnachweise, Prozessdaten, Berechtigungen und Maßnahmenstatus liegen in verschiedenen Systemen. Ob eine Korrekturmaßnahme wirklich gewirkt hat, ist schwer zu belegen.</w:t>
+              <w:spacing w:after="120" w:before="0" w:line="288" w:lineRule="auto"/>
+            </w:pPr>
+            <w:r>
+              <w:rPr>
+                <w:sz w:val="22"/>
+                <w:szCs w:val="22"/>
+              </w:rPr>
+              <w:t xml:space="preserve">Zwischen zwei Prüfzeitpunkten entstehende Abweichungen werden erst bei der nächsten Prüfung sichtbar.</w:t>
+            </w:r>
+          </w:p>
+          <w:p>
+            <w:pPr>
+              <w:spacing w:after="120" w:before="0" w:line="288" w:lineRule="auto"/>
+            </w:pPr>
+            <w:r>
+              <w:rPr>
+                <w:sz w:val="22"/>
+                <w:szCs w:val="22"/>
+              </w:rPr>
+              <w:t xml:space="preserve">Kontrollnachweise, Prozessdaten, Berechtigungen und Maßnahmenstatus liegen in verschiedenen Systemen. Ob eine Korrekturmaßnahme gewirkt hat, ist aufwendig zu belegen.</w:t>
             </w:r>
           </w:p>
         </w:tc>
@@ -2380,38 +2380,38 @@
           </w:p>
           <w:p>
             <w:pPr>
-              <w:spacing w:after="140" w:before="0" w:line="300" w:lineRule="auto"/>
-            </w:pPr>
-            <w:r>
-              <w:rPr>
-                <w:sz w:val="23"/>
-                <w:szCs w:val="23"/>
-              </w:rPr>
-              <w:t xml:space="preserve">Ausgewählte Prozess- und Transaktionsdaten werden laufend gegen definierte Regeln geprüft: Berechtigung ohne Freigabe, verletzte Funktionstrennung, manuelle Überschreibung, Kontrolle ohne Nachweis.</w:t>
-            </w:r>
-          </w:p>
-          <w:p>
-            <w:pPr>
-              <w:spacing w:after="140" w:before="0" w:line="300" w:lineRule="auto"/>
-            </w:pPr>
-            <w:r>
-              <w:rPr>
-                <w:sz w:val="23"/>
-                <w:szCs w:val="23"/>
-              </w:rPr>
-              <w:t xml:space="preserve">Auffälligkeiten werden im Prozesskontext eingeordnet und begründet an die Kontrollverantwortlichen gegeben.</w:t>
-            </w:r>
-          </w:p>
-          <w:p>
-            <w:pPr>
-              <w:spacing w:after="140" w:before="0" w:line="300" w:lineRule="auto"/>
-            </w:pPr>
-            <w:r>
-              <w:rPr>
-                <w:sz w:val="23"/>
-                <w:szCs w:val="23"/>
-              </w:rPr>
-              <w:t xml:space="preserve">Die Revision prüft die Ergebnisse unabhängig und bleibt unabhängig.</w:t>
+              <w:spacing w:after="120" w:before="0" w:line="288" w:lineRule="auto"/>
+            </w:pPr>
+            <w:r>
+              <w:rPr>
+                <w:sz w:val="22"/>
+                <w:szCs w:val="22"/>
+              </w:rPr>
+              <w:t xml:space="preserve">Prozess- und Transaktionsdaten werden laufend gegen definierte Kontrollregeln geprüft, etwa Berechtigungsänderung ohne Freigabe, verletzte Funktionstrennung oder Kontrolle ohne vollständigen Nachweis.</w:t>
+            </w:r>
+          </w:p>
+          <w:p>
+            <w:pPr>
+              <w:spacing w:after="120" w:before="0" w:line="288" w:lineRule="auto"/>
+            </w:pPr>
+            <w:r>
+              <w:rPr>
+                <w:sz w:val="22"/>
+                <w:szCs w:val="22"/>
+              </w:rPr>
+              <w:t xml:space="preserve">Auffälligkeiten werden im Prozesskontext eingeordnet und begründet an die Kontrollverantwortlichen übergeben.</w:t>
+            </w:r>
+          </w:p>
+          <w:p>
+            <w:pPr>
+              <w:spacing w:after="120" w:before="0" w:line="288" w:lineRule="auto"/>
+            </w:pPr>
+            <w:r>
+              <w:rPr>
+                <w:sz w:val="22"/>
+                <w:szCs w:val="22"/>
+              </w:rPr>
+              <w:t xml:space="preserve">Die Interne Revision kann die Ergebnisse unabhängig prüfen.</w:t>
             </w:r>
           </w:p>
         </w:tc>
@@ -2419,7 +2419,7 @@
     </w:tbl>
     <w:p>
       <w:pPr>
-        <w:spacing w:after="320"/>
+        <w:spacing w:after="200"/>
       </w:pPr>
     </w:p>
     <w:p>
@@ -2465,9 +2465,9 @@
             <w:tcW w:type="dxa" w:w="4856"/>
             <w:shd w:fill="F4F5F8" w:color="auto" w:val="clear"/>
             <w:tcMar>
-              <w:top w:type="dxa" w:w="220"/>
+              <w:top w:type="dxa" w:w="180"/>
               <w:left w:type="dxa" w:w="240"/>
-              <w:bottom w:type="dxa" w:w="220"/>
+              <w:bottom w:type="dxa" w:w="180"/>
               <w:right w:type="dxa" w:w="240"/>
             </w:tcMar>
           </w:tcPr>
@@ -2479,10 +2479,10 @@
               <w:rPr>
                 <w:rFonts w:ascii="Cambria" w:cs="Cambria" w:eastAsia="Cambria" w:hAnsi="Cambria"/>
                 <w:color w:val="050A30"/>
-                <w:sz w:val="38"/>
-                <w:szCs w:val="38"/>
-              </w:rPr>
-              <w:t xml:space="preserve">Tage statt Monate</w:t>
+                <w:sz w:val="34"/>
+                <w:szCs w:val="34"/>
+              </w:rPr>
+              <w:t xml:space="preserve">Frühere Erkennung</w:t>
             </w:r>
           </w:p>
           <w:p>
@@ -2495,7 +2495,7 @@
                 <w:sz w:val="20"/>
                 <w:szCs w:val="20"/>
               </w:rPr>
-              <w:t xml:space="preserve">von der Abweichung bis zur Erkennung</w:t>
+              <w:t xml:space="preserve">Abweichungen nahe am Zeitpunkt ihres Entstehens</w:t>
             </w:r>
           </w:p>
         </w:tc>
@@ -2504,9 +2504,9 @@
             <w:tcW w:type="dxa" w:w="4856"/>
             <w:shd w:fill="F4F5F8" w:color="auto" w:val="clear"/>
             <w:tcMar>
-              <w:top w:type="dxa" w:w="220"/>
+              <w:top w:type="dxa" w:w="180"/>
               <w:left w:type="dxa" w:w="240"/>
-              <w:bottom w:type="dxa" w:w="220"/>
+              <w:bottom w:type="dxa" w:w="180"/>
               <w:right w:type="dxa" w:w="240"/>
             </w:tcMar>
           </w:tcPr>
@@ -2518,10 +2518,10 @@
               <w:rPr>
                 <w:rFonts w:ascii="Cambria" w:cs="Cambria" w:eastAsia="Cambria" w:hAnsi="Cambria"/>
                 <w:color w:val="050A30"/>
-                <w:sz w:val="38"/>
-                <w:szCs w:val="38"/>
-              </w:rPr>
-              <w:t xml:space="preserve">Weniger Handarbeit</w:t>
+                <w:sz w:val="34"/>
+                <w:szCs w:val="34"/>
+              </w:rPr>
+              <w:t xml:space="preserve">Weniger manuelle Auswertung</w:t>
             </w:r>
           </w:p>
           <w:p>
@@ -2534,7 +2534,7 @@
                 <w:sz w:val="20"/>
                 <w:szCs w:val="20"/>
               </w:rPr>
-              <w:t xml:space="preserve">Nachweise werden automatisch zusammengeführt</w:t>
+              <w:t xml:space="preserve">Nachweise werden systemseitig zusammengeführt</w:t>
             </w:r>
           </w:p>
         </w:tc>
@@ -2543,9 +2543,9 @@
             <w:tcW w:type="dxa" w:w="4858"/>
             <w:shd w:fill="F4F5F8" w:color="auto" w:val="clear"/>
             <w:tcMar>
-              <w:top w:type="dxa" w:w="220"/>
+              <w:top w:type="dxa" w:w="180"/>
               <w:left w:type="dxa" w:w="240"/>
-              <w:bottom w:type="dxa" w:w="220"/>
+              <w:bottom w:type="dxa" w:w="180"/>
               <w:right w:type="dxa" w:w="240"/>
             </w:tcMar>
           </w:tcPr>
@@ -2557,10 +2557,10 @@
               <w:rPr>
                 <w:rFonts w:ascii="Cambria" w:cs="Cambria" w:eastAsia="Cambria" w:hAnsi="Cambria"/>
                 <w:color w:val="050A30"/>
-                <w:sz w:val="38"/>
-                <w:szCs w:val="38"/>
-              </w:rPr>
-              <w:t xml:space="preserve">Wirksamkeit</w:t>
+                <w:sz w:val="34"/>
+                <w:szCs w:val="34"/>
+              </w:rPr>
+              <w:t xml:space="preserve">Nachweis der Wirksamkeit</w:t>
             </w:r>
           </w:p>
           <w:p>
@@ -2573,7 +2573,7 @@
                 <w:sz w:val="20"/>
                 <w:szCs w:val="20"/>
               </w:rPr>
-              <w:t xml:space="preserve">sichtbar, ob eine Maßnahme die Schwäche tatsächlich geschlossen hat</w:t>
+              <w:t xml:space="preserve">von Korrekturmaßnahmen anhand der Prozessdaten</w:t>
             </w:r>
           </w:p>
         </w:tc>
@@ -2626,7 +2626,7 @@
           <w:sz w:val="28"/>
           <w:szCs w:val="28"/>
         </w:rPr>
-        <w:t xml:space="preserve">Bauverzögerung, steigende Beschaffungskosten, ein Auftragnehmer senkt seine Prognose. Drei kleine Meldungen, die zusammen ein Covenant-Risiko ergeben.</w:t>
+        <w:t xml:space="preserve">Verteilte Signale aus Projektberichten, Covenants und Marktdaten je Finanzierung zusammenführen.</w:t>
       </w:r>
     </w:p>
     <w:tbl>
@@ -2685,26 +2685,26 @@
           </w:p>
           <w:p>
             <w:pPr>
-              <w:spacing w:after="140" w:before="0" w:line="300" w:lineRule="auto"/>
-            </w:pPr>
-            <w:r>
-              <w:rPr>
-                <w:sz w:val="23"/>
-                <w:szCs w:val="23"/>
-              </w:rPr>
-              <w:t xml:space="preserve">88,9 Mrd. € Kreditbestand in Energie, Mobilität und Infrastruktur, begleitet über Laufzeiten von vielen Jahren.</w:t>
-            </w:r>
-          </w:p>
-          <w:p>
-            <w:pPr>
-              <w:spacing w:after="140" w:before="0" w:line="300" w:lineRule="auto"/>
-            </w:pPr>
-            <w:r>
-              <w:rPr>
-                <w:sz w:val="23"/>
-                <w:szCs w:val="23"/>
-              </w:rPr>
-              <w:t xml:space="preserve">Jedes Projekt liefert laufend Finanzberichte, Baufortschritt, Covenant-Reporting, dazu Markt- und Branchendaten.</w:t>
+              <w:spacing w:after="120" w:before="0" w:line="288" w:lineRule="auto"/>
+            </w:pPr>
+            <w:r>
+              <w:rPr>
+                <w:sz w:val="22"/>
+                <w:szCs w:val="22"/>
+              </w:rPr>
+              <w:t xml:space="preserve">Die KfW IPEX-Bank begleitet langfristige Projekte in Energie, Mobilität und Infrastruktur; Ende 2025 lag der Kreditbestand bei 88,9 Mrd. €.</w:t>
+            </w:r>
+          </w:p>
+          <w:p>
+            <w:pPr>
+              <w:spacing w:after="120" w:before="0" w:line="288" w:lineRule="auto"/>
+            </w:pPr>
+            <w:r>
+              <w:rPr>
+                <w:sz w:val="22"/>
+                <w:szCs w:val="22"/>
+              </w:rPr>
+              <w:t xml:space="preserve">Jedes Projekt liefert laufend Finanzberichte, Baufortschrittsmeldungen und Covenant-Reporting; hinzu kommen Markt- und Branchendaten.</w:t>
             </w:r>
           </w:p>
         </w:tc>
@@ -2742,26 +2742,26 @@
           </w:p>
           <w:p>
             <w:pPr>
-              <w:spacing w:after="140" w:before="0" w:line="300" w:lineRule="auto"/>
-            </w:pPr>
-            <w:r>
-              <w:rPr>
-                <w:sz w:val="23"/>
-                <w:szCs w:val="23"/>
-              </w:rPr>
-              <w:t xml:space="preserve">Kritische Entwicklungen kündigen sich selten mit einem Signal an, sondern mit mehreren kleinen, verteilt über Dokumente und Monate.</w:t>
-            </w:r>
-          </w:p>
-          <w:p>
-            <w:pPr>
-              <w:spacing w:after="140" w:before="0" w:line="300" w:lineRule="auto"/>
-            </w:pPr>
-            <w:r>
-              <w:rPr>
-                <w:sz w:val="23"/>
-                <w:szCs w:val="23"/>
-              </w:rPr>
-              <w:t xml:space="preserve">Bei einem Portfolio dieser Größe bleibt im Kreditreview wenig Zeit, diese Signale je Projekt zusammenzuführen.</w:t>
+              <w:spacing w:after="120" w:before="0" w:line="288" w:lineRule="auto"/>
+            </w:pPr>
+            <w:r>
+              <w:rPr>
+                <w:sz w:val="22"/>
+                <w:szCs w:val="22"/>
+              </w:rPr>
+              <w:t xml:space="preserve">Verschlechterungen kündigen sich meist durch mehrere kleine Signale an, verteilt über Dokumente, Quellen und Monate: eine Bauverzögerung, steigende Beschaffungskosten, eine angepasste Prognose eines Auftragnehmers.</w:t>
+            </w:r>
+          </w:p>
+          <w:p>
+            <w:pPr>
+              <w:spacing w:after="120" w:before="0" w:line="288" w:lineRule="auto"/>
+            </w:pPr>
+            <w:r>
+              <w:rPr>
+                <w:sz w:val="22"/>
+                <w:szCs w:val="22"/>
+              </w:rPr>
+              <w:t xml:space="preserve">Bei einem Portfolio dieser Größe ist es im Kreditreview aufwendig, diese Signale je Projekt in einen gemeinsamen Risikokontext zu bringen.</w:t>
             </w:r>
           </w:p>
         </w:tc>
@@ -2799,38 +2799,38 @@
           </w:p>
           <w:p>
             <w:pPr>
-              <w:spacing w:after="140" w:before="0" w:line="300" w:lineRule="auto"/>
-            </w:pPr>
-            <w:r>
-              <w:rPr>
-                <w:sz w:val="23"/>
-                <w:szCs w:val="23"/>
-              </w:rPr>
-              <w:t xml:space="preserve">Das System liest Projektberichte, Vertrags- und Covenant-Dokumente und externe Signale und verknüpft sie mit dem Finanzierungsmodell.</w:t>
-            </w:r>
-          </w:p>
-          <w:p>
-            <w:pPr>
-              <w:spacing w:after="140" w:before="0" w:line="300" w:lineRule="auto"/>
-            </w:pPr>
-            <w:r>
-              <w:rPr>
-                <w:sz w:val="23"/>
-                <w:szCs w:val="23"/>
-              </w:rPr>
-              <w:t xml:space="preserve">Es zeigt, welche Annahmen und Verpflichtungen überprüft werden sollten, und warum.</w:t>
-            </w:r>
-          </w:p>
-          <w:p>
-            <w:pPr>
-              <w:spacing w:after="140" w:before="0" w:line="300" w:lineRule="auto"/>
-            </w:pPr>
-            <w:r>
-              <w:rPr>
-                <w:sz w:val="23"/>
-                <w:szCs w:val="23"/>
-              </w:rPr>
-              <w:t xml:space="preserve">Cashflow-, Deckungsgrad- und Risikorechnungen bleiben in den validierten Modellen.</w:t>
+              <w:spacing w:after="120" w:before="0" w:line="288" w:lineRule="auto"/>
+            </w:pPr>
+            <w:r>
+              <w:rPr>
+                <w:sz w:val="22"/>
+                <w:szCs w:val="22"/>
+              </w:rPr>
+              <w:t xml:space="preserve">Das System liest Projektberichte, Vertrags- und Covenant-Dokumente sowie externe Signale und verknüpft sie mit den Annahmen des Finanzierungsmodells.</w:t>
+            </w:r>
+          </w:p>
+          <w:p>
+            <w:pPr>
+              <w:spacing w:after="120" w:before="0" w:line="288" w:lineRule="auto"/>
+            </w:pPr>
+            <w:r>
+              <w:rPr>
+                <w:sz w:val="22"/>
+                <w:szCs w:val="22"/>
+              </w:rPr>
+              <w:t xml:space="preserve">Es zeigt, welche Annahmen und Verpflichtungen überprüft werden sollten, und begründet dies mit den zugrunde liegenden Quellen.</w:t>
+            </w:r>
+          </w:p>
+          <w:p>
+            <w:pPr>
+              <w:spacing w:after="120" w:before="0" w:line="288" w:lineRule="auto"/>
+            </w:pPr>
+            <w:r>
+              <w:rPr>
+                <w:sz w:val="22"/>
+                <w:szCs w:val="22"/>
+              </w:rPr>
+              <w:t xml:space="preserve">Cashflow-, Deckungsgrad- und Risikoberechnungen bleiben in den validierten Modellen.</w:t>
             </w:r>
           </w:p>
         </w:tc>
@@ -2838,7 +2838,7 @@
     </w:tbl>
     <w:p>
       <w:pPr>
-        <w:spacing w:after="320"/>
+        <w:spacing w:after="200"/>
       </w:pPr>
     </w:p>
     <w:p>
@@ -2884,9 +2884,9 @@
             <w:tcW w:type="dxa" w:w="4856"/>
             <w:shd w:fill="F4F5F8" w:color="auto" w:val="clear"/>
             <w:tcMar>
-              <w:top w:type="dxa" w:w="220"/>
+              <w:top w:type="dxa" w:w="180"/>
               <w:left w:type="dxa" w:w="240"/>
-              <w:bottom w:type="dxa" w:w="220"/>
+              <w:bottom w:type="dxa" w:w="180"/>
               <w:right w:type="dxa" w:w="240"/>
             </w:tcMar>
           </w:tcPr>
@@ -2898,10 +2898,10 @@
               <w:rPr>
                 <w:rFonts w:ascii="Cambria" w:cs="Cambria" w:eastAsia="Cambria" w:hAnsi="Cambria"/>
                 <w:color w:val="050A30"/>
-                <w:sz w:val="38"/>
-                <w:szCs w:val="38"/>
-              </w:rPr>
-              <w:t xml:space="preserve">Vorwarnzeit</w:t>
+                <w:sz w:val="34"/>
+                <w:szCs w:val="34"/>
+              </w:rPr>
+              <w:t xml:space="preserve">Längere Vorwarnzeit</w:t>
             </w:r>
           </w:p>
           <w:p>
@@ -2914,7 +2914,7 @@
                 <w:sz w:val="20"/>
                 <w:szCs w:val="20"/>
               </w:rPr>
-              <w:t xml:space="preserve">Monate früher sehen, wo ein Projekt kippt</w:t>
+              <w:t xml:space="preserve">vor Covenant-Verstößen und Ratingveränderungen</w:t>
             </w:r>
           </w:p>
         </w:tc>
@@ -2923,9 +2923,9 @@
             <w:tcW w:type="dxa" w:w="4856"/>
             <w:shd w:fill="F4F5F8" w:color="auto" w:val="clear"/>
             <w:tcMar>
-              <w:top w:type="dxa" w:w="220"/>
+              <w:top w:type="dxa" w:w="180"/>
               <w:left w:type="dxa" w:w="240"/>
-              <w:bottom w:type="dxa" w:w="220"/>
+              <w:bottom w:type="dxa" w:w="180"/>
               <w:right w:type="dxa" w:w="240"/>
             </w:tcMar>
           </w:tcPr>
@@ -2937,10 +2937,10 @@
               <w:rPr>
                 <w:rFonts w:ascii="Cambria" w:cs="Cambria" w:eastAsia="Cambria" w:hAnsi="Cambria"/>
                 <w:color w:val="050A30"/>
-                <w:sz w:val="38"/>
-                <w:szCs w:val="38"/>
-              </w:rPr>
-              <w:t xml:space="preserve">Schnellere Reviews</w:t>
+                <w:sz w:val="34"/>
+                <w:szCs w:val="34"/>
+              </w:rPr>
+              <w:t xml:space="preserve">Effizientere Kreditreviews</w:t>
             </w:r>
           </w:p>
           <w:p>
@@ -2953,7 +2953,7 @@
                 <w:sz w:val="20"/>
                 <w:szCs w:val="20"/>
               </w:rPr>
-              <w:t xml:space="preserve">weniger Stunden je Kreditreview bei mehr Tiefe</w:t>
+              <w:t xml:space="preserve">weniger Zeit für die Sichtung, mehr für die Bewertung</w:t>
             </w:r>
           </w:p>
         </w:tc>
@@ -2962,9 +2962,9 @@
             <w:tcW w:type="dxa" w:w="4858"/>
             <w:shd w:fill="F4F5F8" w:color="auto" w:val="clear"/>
             <w:tcMar>
-              <w:top w:type="dxa" w:w="220"/>
+              <w:top w:type="dxa" w:w="180"/>
               <w:left w:type="dxa" w:w="240"/>
-              <w:bottom w:type="dxa" w:w="220"/>
+              <w:bottom w:type="dxa" w:w="180"/>
               <w:right w:type="dxa" w:w="240"/>
             </w:tcMar>
           </w:tcPr>
@@ -2976,10 +2976,10 @@
               <w:rPr>
                 <w:rFonts w:ascii="Cambria" w:cs="Cambria" w:eastAsia="Cambria" w:hAnsi="Cambria"/>
                 <w:color w:val="050A30"/>
-                <w:sz w:val="38"/>
-                <w:szCs w:val="38"/>
-              </w:rPr>
-              <w:t xml:space="preserve">Weniger Verluste</w:t>
+                <w:sz w:val="34"/>
+                <w:szCs w:val="34"/>
+              </w:rPr>
+              <w:t xml:space="preserve">Begrenzung von Verlusten</w:t>
             </w:r>
           </w:p>
           <w:p>
@@ -2992,7 +2992,7 @@
                 <w:sz w:val="20"/>
                 <w:szCs w:val="20"/>
               </w:rPr>
-              <w:t xml:space="preserve">früheres Handeln begrenzt Kreditverluste und verbessert die Steuerung</w:t>
+              <w:t xml:space="preserve">durch frühere Maßnahmen bei kritischen Entwicklungen</w:t>
             </w:r>
           </w:p>
         </w:tc>
@@ -3045,7 +3045,7 @@
           <w:sz w:val="28"/>
           <w:szCs w:val="28"/>
         </w:rPr>
-        <w:t xml:space="preserve">Eine Anfrage kommt rein. Statt einer Struktur liegen drei auf dem Tisch, mit Deckung, Voraussetzungen und Risikoaufteilung.</w:t>
+        <w:t xml:space="preserve">Für jede Finanzierungsanfrage alternative ECA-Strukturen systematisch prüfen und vergleichen.</w:t>
       </w:r>
     </w:p>
     <w:tbl>
@@ -3104,26 +3104,26 @@
           </w:p>
           <w:p>
             <w:pPr>
-              <w:spacing w:after="140" w:before="0" w:line="300" w:lineRule="auto"/>
-            </w:pPr>
-            <w:r>
-              <w:rPr>
-                <w:sz w:val="23"/>
-                <w:szCs w:val="23"/>
-              </w:rPr>
-              <w:t xml:space="preserve">Rund 4,4 Mrd. € ECA-Transaktionsvolumen 2025. Die Zahl der Deckungsprodukte bei den Exportkreditagenturen ist stark gewachsen.</w:t>
-            </w:r>
-          </w:p>
-          <w:p>
-            <w:pPr>
-              <w:spacing w:after="140" w:before="0" w:line="300" w:lineRule="auto"/>
-            </w:pPr>
-            <w:r>
-              <w:rPr>
-                <w:sz w:val="23"/>
-                <w:szCs w:val="23"/>
-              </w:rPr>
-              <w:t xml:space="preserve">Ein KI-Projekt zur Dokumentenanalyse läuft bereits.</w:t>
+              <w:spacing w:after="120" w:before="0" w:line="288" w:lineRule="auto"/>
+            </w:pPr>
+            <w:r>
+              <w:rPr>
+                <w:sz w:val="22"/>
+                <w:szCs w:val="22"/>
+              </w:rPr>
+              <w:t xml:space="preserve">Das ECA-Transaktionsvolumen der KfW IPEX-Bank lag 2025 bei rund 4,4 Mrd. €. Die Zahl der Deckungsprodukte der Exportkreditagenturen hat deutlich zugenommen.</w:t>
+            </w:r>
+          </w:p>
+          <w:p>
+            <w:pPr>
+              <w:spacing w:after="120" w:before="0" w:line="288" w:lineRule="auto"/>
+            </w:pPr>
+            <w:r>
+              <w:rPr>
+                <w:sz w:val="22"/>
+                <w:szCs w:val="22"/>
+              </w:rPr>
+              <w:t xml:space="preserve">Ein KI-Projekt zur Dokumentenanalyse ist bereits gestartet.</w:t>
             </w:r>
           </w:p>
         </w:tc>
@@ -3161,26 +3161,26 @@
           </w:p>
           <w:p>
             <w:pPr>
-              <w:spacing w:after="140" w:before="0" w:line="300" w:lineRule="auto"/>
-            </w:pPr>
-            <w:r>
-              <w:rPr>
-                <w:sz w:val="23"/>
-                <w:szCs w:val="23"/>
-              </w:rPr>
-              <w:t xml:space="preserve">Welche Deckung zu einem Projekt passt, hängt von Land, Lieferkette, Risikoprofil und Förderkriterien ab.</w:t>
-            </w:r>
-          </w:p>
-          <w:p>
-            <w:pPr>
-              <w:spacing w:after="140" w:before="0" w:line="300" w:lineRule="auto"/>
-            </w:pPr>
-            <w:r>
-              <w:rPr>
-                <w:sz w:val="23"/>
-                <w:szCs w:val="23"/>
-              </w:rPr>
-              <w:t xml:space="preserve">Unter Zeitdruck wird die naheliegende Struktur gewählt. Alternativen, die ein Mandat erst möglich machen würden, bleiben ungeprüft.</w:t>
+              <w:spacing w:after="120" w:before="0" w:line="288" w:lineRule="auto"/>
+            </w:pPr>
+            <w:r>
+              <w:rPr>
+                <w:sz w:val="22"/>
+                <w:szCs w:val="22"/>
+              </w:rPr>
+              <w:t xml:space="preserve">Welche Deckung zu einem Vorhaben passt, hängt von Land, Lieferkette, Risikokonstellation und Förderkriterien ab.</w:t>
+            </w:r>
+          </w:p>
+          <w:p>
+            <w:pPr>
+              <w:spacing w:after="120" w:before="0" w:line="288" w:lineRule="auto"/>
+            </w:pPr>
+            <w:r>
+              <w:rPr>
+                <w:sz w:val="22"/>
+                <w:szCs w:val="22"/>
+              </w:rPr>
+              <w:t xml:space="preserve">Unter Zeitdruck ist es schwierig, alle Varianten gleichwertig zu prüfen. Strukturen, die ein Mandat erst ermöglichen würden, bleiben dann ungeprüft.</w:t>
             </w:r>
           </w:p>
         </w:tc>
@@ -3218,38 +3218,38 @@
           </w:p>
           <w:p>
             <w:pPr>
-              <w:spacing w:after="140" w:before="0" w:line="300" w:lineRule="auto"/>
-            </w:pPr>
-            <w:r>
-              <w:rPr>
-                <w:sz w:val="23"/>
-                <w:szCs w:val="23"/>
+              <w:spacing w:after="120" w:before="0" w:line="288" w:lineRule="auto"/>
+            </w:pPr>
+            <w:r>
+              <w:rPr>
+                <w:sz w:val="22"/>
+                <w:szCs w:val="22"/>
               </w:rPr>
               <w:t xml:space="preserve">Jede Anfrage wird gegen die Deckungsbedingungen relevanter Agenturen und gegen vergleichbare historische Transaktionen der Bank geprüft.</w:t>
             </w:r>
           </w:p>
           <w:p>
             <w:pPr>
-              <w:spacing w:after="140" w:before="0" w:line="300" w:lineRule="auto"/>
-            </w:pPr>
-            <w:r>
-              <w:rPr>
-                <w:sz w:val="23"/>
-                <w:szCs w:val="23"/>
-              </w:rPr>
-              <w:t xml:space="preserve">Das System schlägt Strukturvarianten vor, mit Voraussetzungen, Risikoaufteilung und wirtschaftlicher Einschätzung.</w:t>
-            </w:r>
-          </w:p>
-          <w:p>
-            <w:pPr>
-              <w:spacing w:after="140" w:before="0" w:line="300" w:lineRule="auto"/>
-            </w:pPr>
-            <w:r>
-              <w:rPr>
-                <w:sz w:val="23"/>
-                <w:szCs w:val="23"/>
-              </w:rPr>
-              <w:t xml:space="preserve">Die Strukturierer entscheiden, welche Variante ins Term Sheet geht.</w:t>
+              <w:spacing w:after="120" w:before="0" w:line="288" w:lineRule="auto"/>
+            </w:pPr>
+            <w:r>
+              <w:rPr>
+                <w:sz w:val="22"/>
+                <w:szCs w:val="22"/>
+              </w:rPr>
+              <w:t xml:space="preserve">Das System stellt Strukturvarianten mit Voraussetzungen, Risikoaufteilung und wirtschaftlicher Einschätzung gegenüber.</w:t>
+            </w:r>
+          </w:p>
+          <w:p>
+            <w:pPr>
+              <w:spacing w:after="120" w:before="0" w:line="288" w:lineRule="auto"/>
+            </w:pPr>
+            <w:r>
+              <w:rPr>
+                <w:sz w:val="22"/>
+                <w:szCs w:val="22"/>
+              </w:rPr>
+              <w:t xml:space="preserve">Die Strukturierungsexperten entscheiden, welche Variante weiterverfolgt wird.</w:t>
             </w:r>
           </w:p>
         </w:tc>
@@ -3257,7 +3257,7 @@
     </w:tbl>
     <w:p>
       <w:pPr>
-        <w:spacing w:after="320"/>
+        <w:spacing w:after="200"/>
       </w:pPr>
     </w:p>
     <w:p>
@@ -3303,9 +3303,9 @@
             <w:tcW w:type="dxa" w:w="4856"/>
             <w:shd w:fill="F4F5F8" w:color="auto" w:val="clear"/>
             <w:tcMar>
-              <w:top w:type="dxa" w:w="220"/>
+              <w:top w:type="dxa" w:w="180"/>
               <w:left w:type="dxa" w:w="240"/>
-              <w:bottom w:type="dxa" w:w="220"/>
+              <w:bottom w:type="dxa" w:w="180"/>
               <w:right w:type="dxa" w:w="240"/>
             </w:tcMar>
           </w:tcPr>
@@ -3317,10 +3317,10 @@
               <w:rPr>
                 <w:rFonts w:ascii="Cambria" w:cs="Cambria" w:eastAsia="Cambria" w:hAnsi="Cambria"/>
                 <w:color w:val="050A30"/>
-                <w:sz w:val="38"/>
-                <w:szCs w:val="38"/>
-              </w:rPr>
-              <w:t xml:space="preserve">Mehr Mandate</w:t>
+                <w:sz w:val="34"/>
+                <w:szCs w:val="34"/>
+              </w:rPr>
+              <w:t xml:space="preserve">Zusätzliche Mandate</w:t>
             </w:r>
           </w:p>
           <w:p>
@@ -3333,7 +3333,7 @@
                 <w:sz w:val="20"/>
                 <w:szCs w:val="20"/>
               </w:rPr>
-              <w:t xml:space="preserve">Anfragen, die heute nicht strukturierbar scheinen, werden es</w:t>
+              <w:t xml:space="preserve">durch Strukturen, die heute nicht systematisch geprüft werden</w:t>
             </w:r>
           </w:p>
         </w:tc>
@@ -3342,9 +3342,9 @@
             <w:tcW w:type="dxa" w:w="4856"/>
             <w:shd w:fill="F4F5F8" w:color="auto" w:val="clear"/>
             <w:tcMar>
-              <w:top w:type="dxa" w:w="220"/>
+              <w:top w:type="dxa" w:w="180"/>
               <w:left w:type="dxa" w:w="240"/>
-              <w:bottom w:type="dxa" w:w="220"/>
+              <w:bottom w:type="dxa" w:w="180"/>
               <w:right w:type="dxa" w:w="240"/>
             </w:tcMar>
           </w:tcPr>
@@ -3356,10 +3356,10 @@
               <w:rPr>
                 <w:rFonts w:ascii="Cambria" w:cs="Cambria" w:eastAsia="Cambria" w:hAnsi="Cambria"/>
                 <w:color w:val="050A30"/>
-                <w:sz w:val="38"/>
-                <w:szCs w:val="38"/>
-              </w:rPr>
-              <w:t xml:space="preserve">Schneller</w:t>
+                <w:sz w:val="34"/>
+                <w:szCs w:val="34"/>
+              </w:rPr>
+              <w:t xml:space="preserve">Kürzere Zeit bis zum Term Sheet</w:t>
             </w:r>
           </w:p>
           <w:p>
@@ -3372,7 +3372,7 @@
                 <w:sz w:val="20"/>
                 <w:szCs w:val="20"/>
               </w:rPr>
-              <w:t xml:space="preserve">kürzere Zeit bis zum belastbaren Term Sheet</w:t>
+              <w:t xml:space="preserve">durch vorbereitete Strukturvergleiche</w:t>
             </w:r>
           </w:p>
         </w:tc>
@@ -3381,9 +3381,9 @@
             <w:tcW w:type="dxa" w:w="4858"/>
             <w:shd w:fill="F4F5F8" w:color="auto" w:val="clear"/>
             <w:tcMar>
-              <w:top w:type="dxa" w:w="220"/>
+              <w:top w:type="dxa" w:w="180"/>
               <w:left w:type="dxa" w:w="240"/>
-              <w:bottom w:type="dxa" w:w="220"/>
+              <w:bottom w:type="dxa" w:w="180"/>
               <w:right w:type="dxa" w:w="240"/>
             </w:tcMar>
           </w:tcPr>
@@ -3395,8 +3395,8 @@
               <w:rPr>
                 <w:rFonts w:ascii="Cambria" w:cs="Cambria" w:eastAsia="Cambria" w:hAnsi="Cambria"/>
                 <w:color w:val="050A30"/>
-                <w:sz w:val="38"/>
-                <w:szCs w:val="38"/>
+                <w:sz w:val="34"/>
+                <w:szCs w:val="34"/>
               </w:rPr>
               <w:t xml:space="preserve">300.000 €</w:t>
             </w:r>
@@ -3427,7 +3427,7 @@
           <w:sz w:val="17"/>
           <w:szCs w:val="17"/>
         </w:rPr>
-        <w:t xml:space="preserve">Der Gebührensatz ist eine Rechenannahme, kein veröffentlichter KfW-Wert.</w:t>
+        <w:t xml:space="preserve">Der Gebührensatz ist eine Rechenannahme, kein veröffentlichter KfW-Wert. Risiko-, Personal- und Strukturierungskosten sind nicht abgezogen.</w:t>
       </w:r>
     </w:p>
     <w:p>
@@ -3476,7 +3476,7 @@
           <w:sz w:val="28"/>
           <w:szCs w:val="28"/>
         </w:rPr>
-        <w:t xml:space="preserve">Mehr Finanzierungsgeschäft, ohne mehr Eigenkapital zu binden: Risiken intelligenter verteilen.</w:t>
+        <w:t xml:space="preserve">Geeignete Konsortialpartner und Syndizierungsstrukturen aus historischen Transaktionen ableiten.</w:t>
       </w:r>
     </w:p>
     <w:tbl>
@@ -3535,26 +3535,26 @@
           </w:p>
           <w:p>
             <w:pPr>
-              <w:spacing w:after="140" w:before="0" w:line="300" w:lineRule="auto"/>
-            </w:pPr>
-            <w:r>
-              <w:rPr>
-                <w:sz w:val="23"/>
-                <w:szCs w:val="23"/>
-              </w:rPr>
-              <w:t xml:space="preserve">6,9 Mrd. € arrangiertes Syndizierungsvolumen 2025. Große Projektfinanzierungen werden mit Banken und institutionellen Investoren geteilt.</w:t>
-            </w:r>
-          </w:p>
-          <w:p>
-            <w:pPr>
-              <w:spacing w:after="140" w:before="0" w:line="300" w:lineRule="auto"/>
-            </w:pPr>
-            <w:r>
-              <w:rPr>
-                <w:sz w:val="23"/>
-                <w:szCs w:val="23"/>
-              </w:rPr>
-              <w:t xml:space="preserve">Wie gut die Platzierung gelingt, entscheidet, wie viel Kapazität für das nächste Geschäft bleibt.</w:t>
+              <w:spacing w:after="120" w:before="0" w:line="288" w:lineRule="auto"/>
+            </w:pPr>
+            <w:r>
+              <w:rPr>
+                <w:sz w:val="22"/>
+                <w:szCs w:val="22"/>
+              </w:rPr>
+              <w:t xml:space="preserve">Die KfW IPEX-Bank wies 2025 ein arrangiertes Syndizierungsvolumen von 6,9 Mrd. € aus. Großvolumige Finanzierungen werden mit Banken und institutionellen Investoren geteilt.</w:t>
+            </w:r>
+          </w:p>
+          <w:p>
+            <w:pPr>
+              <w:spacing w:after="120" w:before="0" w:line="288" w:lineRule="auto"/>
+            </w:pPr>
+            <w:r>
+              <w:rPr>
+                <w:sz w:val="22"/>
+                <w:szCs w:val="22"/>
+              </w:rPr>
+              <w:t xml:space="preserve">Der Erfolg der Platzierung bestimmt, wie viel Kapazität für weiteres Geschäft verfügbar bleibt.</w:t>
             </w:r>
           </w:p>
         </w:tc>
@@ -3592,26 +3592,26 @@
           </w:p>
           <w:p>
             <w:pPr>
-              <w:spacing w:after="140" w:before="0" w:line="300" w:lineRule="auto"/>
-            </w:pPr>
-            <w:r>
-              <w:rPr>
-                <w:sz w:val="23"/>
-                <w:szCs w:val="23"/>
-              </w:rPr>
-              <w:t xml:space="preserve">Für jede Transaktion: Welche Partner passen nach Sektor, Land, Laufzeit, Ticketgröße und Beziehung? Welche Struktur bindet am wenigsten Kapital?</w:t>
-            </w:r>
-          </w:p>
-          <w:p>
-            <w:pPr>
-              <w:spacing w:after="140" w:before="0" w:line="300" w:lineRule="auto"/>
-            </w:pPr>
-            <w:r>
-              <w:rPr>
-                <w:sz w:val="23"/>
-                <w:szCs w:val="23"/>
-              </w:rPr>
-              <w:t xml:space="preserve">Dieses Wissen steckt in Köpfen und alten Deals, nicht in einem System.</w:t>
+              <w:spacing w:after="120" w:before="0" w:line="288" w:lineRule="auto"/>
+            </w:pPr>
+            <w:r>
+              <w:rPr>
+                <w:sz w:val="22"/>
+                <w:szCs w:val="22"/>
+              </w:rPr>
+              <w:t xml:space="preserve">Je Transaktion sind Partner nach Sektor, Land, Laufzeit, Ticketgröße und bestehender Beziehung zu bewerten, dazu Strukturvarianten mit unterschiedlicher Kapitalbindung.</w:t>
+            </w:r>
+          </w:p>
+          <w:p>
+            <w:pPr>
+              <w:spacing w:after="120" w:before="0" w:line="288" w:lineRule="auto"/>
+            </w:pPr>
+            <w:r>
+              <w:rPr>
+                <w:sz w:val="22"/>
+                <w:szCs w:val="22"/>
+              </w:rPr>
+              <w:t xml:space="preserve">Ein großer Teil dieses Wissens liegt in abgeschlossenen Transaktionen und bei einzelnen Personen, nicht in einem auswertbaren System.</w:t>
             </w:r>
           </w:p>
         </w:tc>
@@ -3649,38 +3649,38 @@
           </w:p>
           <w:p>
             <w:pPr>
-              <w:spacing w:after="140" w:before="0" w:line="300" w:lineRule="auto"/>
-            </w:pPr>
-            <w:r>
-              <w:rPr>
-                <w:sz w:val="23"/>
-                <w:szCs w:val="23"/>
-              </w:rPr>
-              <w:t xml:space="preserve">Das System lernt aus historischen Syndizierungen, dokumentierten Partnerpräferenzen und der aktuellen Pipeline.</w:t>
-            </w:r>
-          </w:p>
-          <w:p>
-            <w:pPr>
-              <w:spacing w:after="140" w:before="0" w:line="300" w:lineRule="auto"/>
-            </w:pPr>
-            <w:r>
-              <w:rPr>
-                <w:sz w:val="23"/>
-                <w:szCs w:val="23"/>
+              <w:spacing w:after="120" w:before="0" w:line="288" w:lineRule="auto"/>
+            </w:pPr>
+            <w:r>
+              <w:rPr>
+                <w:sz w:val="22"/>
+                <w:szCs w:val="22"/>
+              </w:rPr>
+              <w:t xml:space="preserve">Das System wertet historische Syndizierungen, dokumentierte Partnerpräferenzen und die aktuelle Pipeline aus.</w:t>
+            </w:r>
+          </w:p>
+          <w:p>
+            <w:pPr>
+              <w:spacing w:after="120" w:before="0" w:line="288" w:lineRule="auto"/>
+            </w:pPr>
+            <w:r>
+              <w:rPr>
+                <w:sz w:val="22"/>
+                <w:szCs w:val="22"/>
               </w:rPr>
               <w:t xml:space="preserve">Es schlägt Partner und Strukturvarianten vor und vergleicht Szenarien nach Platzierbarkeit, Kapitalbindung und Ergebnis, auf Basis der bestehenden Risikomodelle.</w:t>
             </w:r>
           </w:p>
           <w:p>
             <w:pPr>
-              <w:spacing w:after="140" w:before="0" w:line="300" w:lineRule="auto"/>
-            </w:pPr>
-            <w:r>
-              <w:rPr>
-                <w:sz w:val="23"/>
-                <w:szCs w:val="23"/>
-              </w:rPr>
-              <w:t xml:space="preserve">Das Syndizierungsteam spricht die richtigen Partner zuerst an.</w:t>
+              <w:spacing w:after="120" w:before="0" w:line="288" w:lineRule="auto"/>
+            </w:pPr>
+            <w:r>
+              <w:rPr>
+                <w:sz w:val="22"/>
+                <w:szCs w:val="22"/>
+              </w:rPr>
+              <w:t xml:space="preserve">Das Syndizierungsteam entscheidet über Ansprache und Struktur.</w:t>
             </w:r>
           </w:p>
         </w:tc>
@@ -3688,7 +3688,7 @@
     </w:tbl>
     <w:p>
       <w:pPr>
-        <w:spacing w:after="320"/>
+        <w:spacing w:after="200"/>
       </w:pPr>
     </w:p>
     <w:p>
@@ -3734,9 +3734,9 @@
             <w:tcW w:type="dxa" w:w="4856"/>
             <w:shd w:fill="F4F5F8" w:color="auto" w:val="clear"/>
             <w:tcMar>
-              <w:top w:type="dxa" w:w="220"/>
+              <w:top w:type="dxa" w:w="180"/>
               <w:left w:type="dxa" w:w="240"/>
-              <w:bottom w:type="dxa" w:w="220"/>
+              <w:bottom w:type="dxa" w:w="180"/>
               <w:right w:type="dxa" w:w="240"/>
             </w:tcMar>
           </w:tcPr>
@@ -3748,10 +3748,10 @@
               <w:rPr>
                 <w:rFonts w:ascii="Cambria" w:cs="Cambria" w:eastAsia="Cambria" w:hAnsi="Cambria"/>
                 <w:color w:val="050A30"/>
-                <w:sz w:val="38"/>
-                <w:szCs w:val="38"/>
-              </w:rPr>
-              <w:t xml:space="preserve">Höhere Platzierung</w:t>
+                <w:sz w:val="34"/>
+                <w:szCs w:val="34"/>
+              </w:rPr>
+              <w:t xml:space="preserve">Höhere Platzierungsquote</w:t>
             </w:r>
           </w:p>
           <w:p>
@@ -3764,7 +3764,7 @@
                 <w:sz w:val="20"/>
                 <w:szCs w:val="20"/>
               </w:rPr>
-              <w:t xml:space="preserve">mehr Tranchen erfolgreich und schneller platziert</w:t>
+              <w:t xml:space="preserve">und kürzere Zeit bis zur Syndizierung</w:t>
             </w:r>
           </w:p>
         </w:tc>
@@ -3773,9 +3773,9 @@
             <w:tcW w:type="dxa" w:w="4856"/>
             <w:shd w:fill="F4F5F8" w:color="auto" w:val="clear"/>
             <w:tcMar>
-              <w:top w:type="dxa" w:w="220"/>
+              <w:top w:type="dxa" w:w="180"/>
               <w:left w:type="dxa" w:w="240"/>
-              <w:bottom w:type="dxa" w:w="220"/>
+              <w:bottom w:type="dxa" w:w="180"/>
               <w:right w:type="dxa" w:w="240"/>
             </w:tcMar>
           </w:tcPr>
@@ -3787,10 +3787,10 @@
               <w:rPr>
                 <w:rFonts w:ascii="Cambria" w:cs="Cambria" w:eastAsia="Cambria" w:hAnsi="Cambria"/>
                 <w:color w:val="050A30"/>
-                <w:sz w:val="38"/>
-                <w:szCs w:val="38"/>
-              </w:rPr>
-              <w:t xml:space="preserve">Kapitaleffizienz</w:t>
+                <w:sz w:val="34"/>
+                <w:szCs w:val="34"/>
+              </w:rPr>
+              <w:t xml:space="preserve">Geringere Kapitalbindung</w:t>
             </w:r>
           </w:p>
           <w:p>
@@ -3803,7 +3803,7 @@
                 <w:sz w:val="20"/>
                 <w:szCs w:val="20"/>
               </w:rPr>
-              <w:t xml:space="preserve">weniger gebundene Eigenmittel je Transaktion</w:t>
+              <w:t xml:space="preserve">je Transaktion durch passendere Strukturen</w:t>
             </w:r>
           </w:p>
         </w:tc>
@@ -3812,9 +3812,9 @@
             <w:tcW w:type="dxa" w:w="4858"/>
             <w:shd w:fill="F4F5F8" w:color="auto" w:val="clear"/>
             <w:tcMar>
-              <w:top w:type="dxa" w:w="220"/>
+              <w:top w:type="dxa" w:w="180"/>
               <w:left w:type="dxa" w:w="240"/>
-              <w:bottom w:type="dxa" w:w="220"/>
+              <w:bottom w:type="dxa" w:w="180"/>
               <w:right w:type="dxa" w:w="240"/>
             </w:tcMar>
           </w:tcPr>
@@ -3826,10 +3826,10 @@
               <w:rPr>
                 <w:rFonts w:ascii="Cambria" w:cs="Cambria" w:eastAsia="Cambria" w:hAnsi="Cambria"/>
                 <w:color w:val="050A30"/>
-                <w:sz w:val="38"/>
-                <w:szCs w:val="38"/>
-              </w:rPr>
-              <w:t xml:space="preserve">Wachstum</w:t>
+                <w:sz w:val="34"/>
+                <w:szCs w:val="34"/>
+              </w:rPr>
+              <w:t xml:space="preserve">Zusätzliches Geschäft</w:t>
             </w:r>
           </w:p>
           <w:p>
@@ -3842,7 +3842,7 @@
                 <w:sz w:val="20"/>
                 <w:szCs w:val="20"/>
               </w:rPr>
-              <w:t xml:space="preserve">zusätzliche Finanzierungen innerhalb bestehender Limite</w:t>
+              <w:t xml:space="preserve">innerhalb bestehender Risiko- und Kapitalvorgaben</w:t>
             </w:r>
           </w:p>
         </w:tc>

</xml_diff>

<commit_message>
KfW pitch: bold key terms and add figures
Co-Authored-By: Claude Fable 5.1 <noreply@anthropic.com>
Claude-Session: https://claude.ai/code/session_01WgH5MQtMPfeH2xdzPfnJgy
</commit_message>
<xml_diff>
--- a/pitch/KfW_KI-Anwendungsfaelle.docx
+++ b/pitch/KfW_KI-Anwendungsfaelle.docx
@@ -86,19 +86,155 @@
           <w:sz w:val="22"/>
           <w:szCs w:val="22"/>
         </w:rPr>
-        <w:t xml:space="preserve">Die Anforderungen an Prüfung, Dokumentation und Absicherung nehmen zu: DORA, neue EBA-Leitlinien zu Drittparteienrisiken, Cyberresilienz und IT-Kontrollen als Aufsichtsschwerpunkt der EZB 2026–2028. Im Finanzierungsgeschäft der KfW IPEX-Bank entscheidet zugleich die Qualität und Geschwindigkeit der Strukturierung über Mandate. Die Fachkapazität in Revision, Compliance, IT-Security und Front Office wächst nicht im gleichen Maß.</w:t>
-      </w:r>
-    </w:p>
-    <w:p>
-      <w:pPr>
-        <w:spacing w:after="320" w:before="0" w:line="300" w:lineRule="auto"/>
-      </w:pPr>
-      <w:r>
-        <w:rPr>
+        <w:t xml:space="preserve">Die Anforderungen an Prüfung, Dokumentation und Absicherung nehmen zu: </w:t>
+      </w:r>
+      <w:r>
+        <w:rPr>
+          <w:b/>
+          <w:bCs/>
+          <w:color w:val="050A30"/>
           <w:sz w:val="22"/>
           <w:szCs w:val="22"/>
         </w:rPr>
-        <w:t xml:space="preserve">Die KfW verfügt über etablierte Prozesse und erste KI-Anwendungen. Der nächste Schritt sind Systeme, die Quellen miteinander verknüpfen, Abweichungen und Risiken früher sichtbar machen, Entscheidungen vorbereiten und jede Aussage mit einem Nachweis versehen. Acht Anwendungsfälle entlang bestehender KfW-Prozesse:</w:t>
+        <w:t xml:space="preserve">DORA</w:t>
+      </w:r>
+      <w:r>
+        <w:rPr>
+          <w:sz w:val="22"/>
+          <w:szCs w:val="22"/>
+        </w:rPr>
+        <w:t xml:space="preserve"> seit Januar 2025, neue </w:t>
+      </w:r>
+      <w:r>
+        <w:rPr>
+          <w:b/>
+          <w:bCs/>
+          <w:color w:val="050A30"/>
+          <w:sz w:val="22"/>
+          <w:szCs w:val="22"/>
+        </w:rPr>
+        <w:t xml:space="preserve">EBA-Leitlinien</w:t>
+      </w:r>
+      <w:r>
+        <w:rPr>
+          <w:sz w:val="22"/>
+          <w:szCs w:val="22"/>
+        </w:rPr>
+        <w:t xml:space="preserve"> zu Drittparteienrisiken (September 2026), </w:t>
+      </w:r>
+      <w:r>
+        <w:rPr>
+          <w:b/>
+          <w:bCs/>
+          <w:color w:val="050A30"/>
+          <w:sz w:val="22"/>
+          <w:szCs w:val="22"/>
+        </w:rPr>
+        <w:t xml:space="preserve">Cyberresilienz und IT-Kontrollen</w:t>
+      </w:r>
+      <w:r>
+        <w:rPr>
+          <w:sz w:val="22"/>
+          <w:szCs w:val="22"/>
+        </w:rPr>
+        <w:t xml:space="preserve"> als Aufsichtsschwerpunkt der EZB </w:t>
+      </w:r>
+      <w:r>
+        <w:rPr>
+          <w:b/>
+          <w:bCs/>
+          <w:color w:val="050A30"/>
+          <w:sz w:val="22"/>
+          <w:szCs w:val="22"/>
+        </w:rPr>
+        <w:t xml:space="preserve">2026–2028</w:t>
+      </w:r>
+      <w:r>
+        <w:rPr>
+          <w:sz w:val="22"/>
+          <w:szCs w:val="22"/>
+        </w:rPr>
+        <w:t xml:space="preserve">. Im Finanzierungsgeschäft der KfW IPEX-Bank (</w:t>
+      </w:r>
+      <w:r>
+        <w:rPr>
+          <w:b/>
+          <w:bCs/>
+          <w:color w:val="050A30"/>
+          <w:sz w:val="22"/>
+          <w:szCs w:val="22"/>
+        </w:rPr>
+        <w:t xml:space="preserve">24,2 Mrd. € Neuzusagen 2025</w:t>
+      </w:r>
+      <w:r>
+        <w:rPr>
+          <w:sz w:val="22"/>
+          <w:szCs w:val="22"/>
+        </w:rPr>
+        <w:t xml:space="preserve">) entscheidet zugleich die Qualität und Geschwindigkeit der Strukturierung über Mandate. Die Fachkapazität in Revision, Compliance, IT-Security und Front Office wächst nicht im gleichen Maß.</w:t>
+      </w:r>
+    </w:p>
+    <w:p>
+      <w:pPr>
+        <w:spacing w:after="320" w:before="0" w:line="300" w:lineRule="auto"/>
+      </w:pPr>
+      <w:r>
+        <w:rPr>
+          <w:sz w:val="22"/>
+          <w:szCs w:val="22"/>
+        </w:rPr>
+        <w:t xml:space="preserve">Die KfW verfügt über etablierte Prozesse und erste KI-Anwendungen. Der nächste Schritt sind Systeme, die </w:t>
+      </w:r>
+      <w:r>
+        <w:rPr>
+          <w:b/>
+          <w:bCs/>
+          <w:color w:val="050A30"/>
+          <w:sz w:val="22"/>
+          <w:szCs w:val="22"/>
+        </w:rPr>
+        <w:t xml:space="preserve">Quellen verknüpfen</w:t>
+      </w:r>
+      <w:r>
+        <w:rPr>
+          <w:sz w:val="22"/>
+          <w:szCs w:val="22"/>
+        </w:rPr>
+        <w:t xml:space="preserve">, Abweichungen und Risiken </w:t>
+      </w:r>
+      <w:r>
+        <w:rPr>
+          <w:b/>
+          <w:bCs/>
+          <w:color w:val="050A30"/>
+          <w:sz w:val="22"/>
+          <w:szCs w:val="22"/>
+        </w:rPr>
+        <w:t xml:space="preserve">früher sichtbar machen</w:t>
+      </w:r>
+      <w:r>
+        <w:rPr>
+          <w:sz w:val="22"/>
+          <w:szCs w:val="22"/>
+        </w:rPr>
+        <w:t xml:space="preserve">, Entscheidungen vorbereiten und </w:t>
+      </w:r>
+      <w:r>
+        <w:rPr>
+          <w:b/>
+          <w:bCs/>
+          <w:color w:val="050A30"/>
+          <w:sz w:val="22"/>
+          <w:szCs w:val="22"/>
+        </w:rPr>
+        <w:t xml:space="preserve">jede Aussage mit einem Nachweis</w:t>
+      </w:r>
+      <w:r>
+        <w:rPr>
+          <w:sz w:val="22"/>
+          <w:szCs w:val="22"/>
+        </w:rPr>
+        <w:t xml:space="preserve"> versehen. Acht Anwendungsfälle entlang bestehender KfW-Prozesse:</w:t>
       </w:r>
     </w:p>
     <w:tbl>
@@ -618,7 +754,41 @@
                 <w:sz w:val="22"/>
                 <w:szCs w:val="22"/>
               </w:rPr>
-              <w:t xml:space="preserve">Der Aufwand liegt nicht im Auffinden der Veröffentlichung, sondern im Abgleich: Eine Änderung kann viele SFO-Dokumente betreffen, die einzeln geprüft werden müssen.</w:t>
+              <w:t xml:space="preserve">Der Aufwand liegt nicht im Auffinden der Veröffentlichung, sondern im </w:t>
+            </w:r>
+            <w:r>
+              <w:rPr>
+                <w:b/>
+                <w:bCs/>
+                <w:color w:val="050A30"/>
+                <w:sz w:val="22"/>
+                <w:szCs w:val="22"/>
+              </w:rPr>
+              <w:t xml:space="preserve">Abgleich</w:t>
+            </w:r>
+            <w:r>
+              <w:rPr>
+                <w:sz w:val="22"/>
+                <w:szCs w:val="22"/>
+              </w:rPr>
+              <w:t xml:space="preserve">: Eine Änderung kann </w:t>
+            </w:r>
+            <w:r>
+              <w:rPr>
+                <w:b/>
+                <w:bCs/>
+                <w:color w:val="050A30"/>
+                <w:sz w:val="22"/>
+                <w:szCs w:val="22"/>
+              </w:rPr>
+              <w:t xml:space="preserve">viele SFO-Dokumente</w:t>
+            </w:r>
+            <w:r>
+              <w:rPr>
+                <w:sz w:val="22"/>
+                <w:szCs w:val="22"/>
+              </w:rPr>
+              <w:t xml:space="preserve"> betreffen, die einzeln geprüft werden müssen.</w:t>
             </w:r>
           </w:p>
           <w:p>
@@ -687,7 +857,41 @@
                 <w:sz w:val="22"/>
                 <w:szCs w:val="22"/>
               </w:rPr>
-              <w:t xml:space="preserve">Es gleicht die Anforderungen mit der SFO ab, markiert betroffene Passagen und schlägt Änderungstexte vor. Jede Stelle trägt den Verweis auf die Quelle.</w:t>
+              <w:t xml:space="preserve">Es gleicht die Anforderungen mit der SFO ab, </w:t>
+            </w:r>
+            <w:r>
+              <w:rPr>
+                <w:b/>
+                <w:bCs/>
+                <w:color w:val="050A30"/>
+                <w:sz w:val="22"/>
+                <w:szCs w:val="22"/>
+              </w:rPr>
+              <w:t xml:space="preserve">markiert betroffene Passagen</w:t>
+            </w:r>
+            <w:r>
+              <w:rPr>
+                <w:sz w:val="22"/>
+                <w:szCs w:val="22"/>
+              </w:rPr>
+              <w:t xml:space="preserve"> und </w:t>
+            </w:r>
+            <w:r>
+              <w:rPr>
+                <w:b/>
+                <w:bCs/>
+                <w:color w:val="050A30"/>
+                <w:sz w:val="22"/>
+                <w:szCs w:val="22"/>
+              </w:rPr>
+              <w:t xml:space="preserve">schlägt Änderungstexte vor</w:t>
+            </w:r>
+            <w:r>
+              <w:rPr>
+                <w:sz w:val="22"/>
+                <w:szCs w:val="22"/>
+              </w:rPr>
+              <w:t xml:space="preserve">. Jede Stelle trägt den Verweis auf die Quelle.</w:t>
             </w:r>
           </w:p>
           <w:p>
@@ -783,7 +987,17 @@
                 <w:sz w:val="20"/>
                 <w:szCs w:val="20"/>
               </w:rPr>
-              <w:t xml:space="preserve">von der Veröffentlichung bis zur dokumentierten Betroffenheitsanalyse</w:t>
+              <w:t xml:space="preserve">von der Veröffentlichung bis zur </w:t>
+            </w:r>
+            <w:r>
+              <w:rPr>
+                <w:b/>
+                <w:bCs/>
+                <w:color w:val="050A30"/>
+                <w:sz w:val="20"/>
+                <w:szCs w:val="20"/>
+              </w:rPr>
+              <w:t xml:space="preserve">dokumentierten Betroffenheitsanalyse</w:t>
             </w:r>
           </w:p>
         </w:tc>
@@ -877,7 +1091,7 @@
           <w:sz w:val="17"/>
           <w:szCs w:val="17"/>
         </w:rPr>
-        <w:t xml:space="preserve">Beispiel: EBA-Leitlinien zum Drittparteienrisikomanagement, finalisiert am 18.09.2026, noch nicht anwendbar. Das System muss diesen Status korrekt erkennen.</w:t>
+        <w:t xml:space="preserve">Beispiel: EBA-Leitlinien zum Drittparteienrisikomanagement, finalisiert am 18.09.2026, noch nicht anwendbar; Umsetzungsfrist voraussichtlich 2027. Das System muss diesen Status korrekt erkennen.</w:t>
       </w:r>
     </w:p>
     <w:p>
@@ -992,7 +1206,41 @@
                 <w:sz w:val="22"/>
                 <w:szCs w:val="22"/>
               </w:rPr>
-              <w:t xml:space="preserve">Die Konzernrevision arbeitet mit rund 100 Beschäftigten in vier Abteilungen und führt etwa 60 Prüfungen im Jahr durch.</w:t>
+              <w:t xml:space="preserve">Die Konzernrevision arbeitet mit </w:t>
+            </w:r>
+            <w:r>
+              <w:rPr>
+                <w:b/>
+                <w:bCs/>
+                <w:color w:val="050A30"/>
+                <w:sz w:val="22"/>
+                <w:szCs w:val="22"/>
+              </w:rPr>
+              <w:t xml:space="preserve">rund 100 Beschäftigten</w:t>
+            </w:r>
+            <w:r>
+              <w:rPr>
+                <w:sz w:val="22"/>
+                <w:szCs w:val="22"/>
+              </w:rPr>
+              <w:t xml:space="preserve"> in vier Abteilungen und führt </w:t>
+            </w:r>
+            <w:r>
+              <w:rPr>
+                <w:b/>
+                <w:bCs/>
+                <w:color w:val="050A30"/>
+                <w:sz w:val="22"/>
+                <w:szCs w:val="22"/>
+              </w:rPr>
+              <w:t xml:space="preserve">etwa 60 Prüfungen im Jahr</w:t>
+            </w:r>
+            <w:r>
+              <w:rPr>
+                <w:sz w:val="22"/>
+                <w:szCs w:val="22"/>
+              </w:rPr>
+              <w:t xml:space="preserve"> durch.</w:t>
             </w:r>
           </w:p>
           <w:p>
@@ -1061,7 +1309,41 @@
                 <w:sz w:val="22"/>
                 <w:szCs w:val="22"/>
               </w:rPr>
-              <w:t xml:space="preserve">Dieser Anteil der Arbeitszeit steht nicht für die Risikobewertung und die fachliche Vertiefung zur Verfügung.</w:t>
+              <w:t xml:space="preserve">Bei angenommenen </w:t>
+            </w:r>
+            <w:r>
+              <w:rPr>
+                <w:b/>
+                <w:bCs/>
+                <w:color w:val="050A30"/>
+                <w:sz w:val="22"/>
+                <w:szCs w:val="22"/>
+              </w:rPr>
+              <w:t xml:space="preserve">20 Stunden je Bericht</w:t>
+            </w:r>
+            <w:r>
+              <w:rPr>
+                <w:sz w:val="22"/>
+                <w:szCs w:val="22"/>
+              </w:rPr>
+              <w:t xml:space="preserve"> sind das rund </w:t>
+            </w:r>
+            <w:r>
+              <w:rPr>
+                <w:b/>
+                <w:bCs/>
+                <w:color w:val="050A30"/>
+                <w:sz w:val="22"/>
+                <w:szCs w:val="22"/>
+              </w:rPr>
+              <w:t xml:space="preserve">1.200 Stunden im Jahr</w:t>
+            </w:r>
+            <w:r>
+              <w:rPr>
+                <w:sz w:val="22"/>
+                <w:szCs w:val="22"/>
+              </w:rPr>
+              <w:t xml:space="preserve">, die nicht für Risikobewertung und fachliche Vertiefung zur Verfügung stehen.</w:t>
             </w:r>
           </w:p>
         </w:tc>
@@ -1118,7 +1400,24 @@
                 <w:sz w:val="22"/>
                 <w:szCs w:val="22"/>
               </w:rPr>
-              <w:t xml:space="preserve">Daraus entstehen Entwürfe für Feststellungen und Bericht. Jede Aussage verweist auf ihren Nachweis; unbelegte Aussagen und Widersprüche werden gekennzeichnet.</w:t>
+              <w:t xml:space="preserve">Daraus entstehen Entwürfe für Feststellungen und Bericht. </w:t>
+            </w:r>
+            <w:r>
+              <w:rPr>
+                <w:b/>
+                <w:bCs/>
+                <w:color w:val="050A30"/>
+                <w:sz w:val="22"/>
+                <w:szCs w:val="22"/>
+              </w:rPr>
+              <w:t xml:space="preserve">Jede Aussage verweist auf ihren Nachweis</w:t>
+            </w:r>
+            <w:r>
+              <w:rPr>
+                <w:sz w:val="22"/>
+                <w:szCs w:val="22"/>
+              </w:rPr>
+              <w:t xml:space="preserve">; unbelegte Aussagen und Widersprüche werden gekennzeichnet.</w:t>
             </w:r>
           </w:p>
           <w:p>
@@ -1201,7 +1500,7 @@
                 <w:sz w:val="34"/>
                 <w:szCs w:val="34"/>
               </w:rPr>
-              <w:t xml:space="preserve">Weniger Dokumentationsaufwand</w:t>
+              <w:t xml:space="preserve">1.200 Stunden</w:t>
             </w:r>
           </w:p>
           <w:p>
@@ -1214,7 +1513,25 @@
                 <w:sz w:val="20"/>
                 <w:szCs w:val="20"/>
               </w:rPr>
-              <w:t xml:space="preserve">bei 20 Stunden je Bericht rund 1.200 Stunden im Jahr (Annahme)</w:t>
+              <w:t xml:space="preserve">pro Jahr weniger Dokumentationsaufwand, entspricht </w:t>
+            </w:r>
+            <w:r>
+              <w:rPr>
+                <w:b/>
+                <w:bCs/>
+                <w:color w:val="050A30"/>
+                <w:sz w:val="20"/>
+                <w:szCs w:val="20"/>
+              </w:rPr>
+              <w:t xml:space="preserve">rund 120.000 €</w:t>
+            </w:r>
+            <w:r>
+              <w:rPr>
+                <w:color w:val="6B7080"/>
+                <w:sz w:val="20"/>
+                <w:szCs w:val="20"/>
+              </w:rPr>
+              <w:t xml:space="preserve"> (Annahme)</w:t>
             </w:r>
           </w:p>
         </w:tc>
@@ -1253,7 +1570,17 @@
                 <w:sz w:val="20"/>
                 <w:szCs w:val="20"/>
               </w:rPr>
-              <w:t xml:space="preserve">gleiche Struktur und Nachweistiefe über alle Prüfungen</w:t>
+              <w:t xml:space="preserve">gleiche Struktur und Nachweistiefe über </w:t>
+            </w:r>
+            <w:r>
+              <w:rPr>
+                <w:b/>
+                <w:bCs/>
+                <w:color w:val="050A30"/>
+                <w:sz w:val="20"/>
+                <w:szCs w:val="20"/>
+              </w:rPr>
+              <w:t xml:space="preserve">alle 60 Prüfungen</w:t>
             </w:r>
           </w:p>
         </w:tc>
@@ -1423,7 +1750,41 @@
                 <w:sz w:val="22"/>
                 <w:szCs w:val="22"/>
               </w:rPr>
-              <w:t xml:space="preserve">Der Finanzbericht 2025 nennt Cyberangriffe und fehlerhafte Systemänderungen als zentrale IKT-Risiken. Die EZB führt Cyberresilienz und Penetrationstests als Aufsichtsschwerpunkt 2026–2028.</w:t>
+              <w:t xml:space="preserve">Der </w:t>
+            </w:r>
+            <w:r>
+              <w:rPr>
+                <w:b/>
+                <w:bCs/>
+                <w:color w:val="050A30"/>
+                <w:sz w:val="22"/>
+                <w:szCs w:val="22"/>
+              </w:rPr>
+              <w:t xml:space="preserve">Finanzbericht 2025</w:t>
+            </w:r>
+            <w:r>
+              <w:rPr>
+                <w:sz w:val="22"/>
+                <w:szCs w:val="22"/>
+              </w:rPr>
+              <w:t xml:space="preserve"> nennt Cyberangriffe und fehlerhafte Systemänderungen als zentrale IKT-Risiken. Die EZB führt Cyberresilienz und Penetrationstests als Aufsichtsschwerpunkt </w:t>
+            </w:r>
+            <w:r>
+              <w:rPr>
+                <w:b/>
+                <w:bCs/>
+                <w:color w:val="050A30"/>
+                <w:sz w:val="22"/>
+                <w:szCs w:val="22"/>
+              </w:rPr>
+              <w:t xml:space="preserve">2026–2028</w:t>
+            </w:r>
+            <w:r>
+              <w:rPr>
+                <w:sz w:val="22"/>
+                <w:szCs w:val="22"/>
+              </w:rPr>
+              <w:t xml:space="preserve">.</w:t>
             </w:r>
           </w:p>
           <w:p>
@@ -1480,7 +1841,41 @@
                 <w:sz w:val="22"/>
                 <w:szCs w:val="22"/>
               </w:rPr>
-              <w:t xml:space="preserve">Eine Anwendung kann im Betrieb stabil laufen und dennoch Komponenten ohne Herstellersupport oder mit bekannten, aktiv ausgenutzten Schwachstellen enthalten.</w:t>
+              <w:t xml:space="preserve">Eine Anwendung kann im Betrieb stabil laufen und dennoch Komponenten </w:t>
+            </w:r>
+            <w:r>
+              <w:rPr>
+                <w:b/>
+                <w:bCs/>
+                <w:color w:val="050A30"/>
+                <w:sz w:val="22"/>
+                <w:szCs w:val="22"/>
+              </w:rPr>
+              <w:t xml:space="preserve">ohne Herstellersupport</w:t>
+            </w:r>
+            <w:r>
+              <w:rPr>
+                <w:sz w:val="22"/>
+                <w:szCs w:val="22"/>
+              </w:rPr>
+              <w:t xml:space="preserve"> oder mit bekannten, </w:t>
+            </w:r>
+            <w:r>
+              <w:rPr>
+                <w:b/>
+                <w:bCs/>
+                <w:color w:val="050A30"/>
+                <w:sz w:val="22"/>
+                <w:szCs w:val="22"/>
+              </w:rPr>
+              <w:t xml:space="preserve">aktiv ausgenutzten Schwachstellen</w:t>
+            </w:r>
+            <w:r>
+              <w:rPr>
+                <w:sz w:val="22"/>
+                <w:szCs w:val="22"/>
+              </w:rPr>
+              <w:t xml:space="preserve"> enthalten. OWASP führt veraltete Komponenten als eigenes Top-10-Risiko (A06).</w:t>
             </w:r>
           </w:p>
           <w:p>
@@ -1534,10 +1929,37 @@
             </w:pPr>
             <w:r>
               <w:rPr>
-                <w:sz w:val="22"/>
-                <w:szCs w:val="22"/>
-              </w:rPr>
-              <w:t xml:space="preserve">Komponenteninventar (SBOM) je Anwendung aus Repositories und Build-Artefakten; Abgleich mit Schwachstellendaten, Supportstatus und dem CISA-Katalog aktiv ausgenutzter Schwachstellen.</w:t>
+                <w:b/>
+                <w:bCs/>
+                <w:color w:val="050A30"/>
+                <w:sz w:val="22"/>
+                <w:szCs w:val="22"/>
+              </w:rPr>
+              <w:t xml:space="preserve">Komponenteninventar (SBOM)</w:t>
+            </w:r>
+            <w:r>
+              <w:rPr>
+                <w:sz w:val="22"/>
+                <w:szCs w:val="22"/>
+              </w:rPr>
+              <w:t xml:space="preserve"> je Anwendung aus Repositories und Build-Artefakten; Abgleich mit Schwachstellendaten, Supportstatus und dem </w:t>
+            </w:r>
+            <w:r>
+              <w:rPr>
+                <w:b/>
+                <w:bCs/>
+                <w:color w:val="050A30"/>
+                <w:sz w:val="22"/>
+                <w:szCs w:val="22"/>
+              </w:rPr>
+              <w:t xml:space="preserve">CISA-Katalog</w:t>
+            </w:r>
+            <w:r>
+              <w:rPr>
+                <w:sz w:val="22"/>
+                <w:szCs w:val="22"/>
+              </w:rPr>
+              <w:t xml:space="preserve"> aktiv ausgenutzter Schwachstellen.</w:t>
             </w:r>
           </w:p>
           <w:p>
@@ -1561,7 +1983,24 @@
                 <w:sz w:val="22"/>
                 <w:szCs w:val="22"/>
               </w:rPr>
-              <w:t xml:space="preserve">Ergänzend ein Report zu Software- und Code-Alter je Anwendung.</w:t>
+              <w:t xml:space="preserve">Ergänzend ein </w:t>
+            </w:r>
+            <w:r>
+              <w:rPr>
+                <w:b/>
+                <w:bCs/>
+                <w:color w:val="050A30"/>
+                <w:sz w:val="22"/>
+                <w:szCs w:val="22"/>
+              </w:rPr>
+              <w:t xml:space="preserve">Report zu Software- und Code-Alter</w:t>
+            </w:r>
+            <w:r>
+              <w:rPr>
+                <w:sz w:val="22"/>
+                <w:szCs w:val="22"/>
+              </w:rPr>
+              <w:t xml:space="preserve"> je Anwendung.</w:t>
             </w:r>
           </w:p>
         </w:tc>
@@ -1641,11 +2080,39 @@
             </w:pPr>
             <w:r>
               <w:rPr>
-                <w:color w:val="6B7080"/>
+                <w:b/>
+                <w:bCs/>
+                <w:color w:val="050A30"/>
                 <w:sz w:val="20"/>
                 <w:szCs w:val="20"/>
               </w:rPr>
-              <w:t xml:space="preserve">Software-Alter, End-of-Life-Quote und erreichbare kritische Schwachstellen je Anwendung</w:t>
+              <w:t xml:space="preserve">Software-Alter</w:t>
+            </w:r>
+            <w:r>
+              <w:rPr>
+                <w:color w:val="6B7080"/>
+                <w:sz w:val="20"/>
+                <w:szCs w:val="20"/>
+              </w:rPr>
+              <w:t xml:space="preserve">, </w:t>
+            </w:r>
+            <w:r>
+              <w:rPr>
+                <w:b/>
+                <w:bCs/>
+                <w:color w:val="050A30"/>
+                <w:sz w:val="20"/>
+                <w:szCs w:val="20"/>
+              </w:rPr>
+              <w:t xml:space="preserve">End-of-Life-Quote</w:t>
+            </w:r>
+            <w:r>
+              <w:rPr>
+                <w:color w:val="6B7080"/>
+                <w:sz w:val="20"/>
+                <w:szCs w:val="20"/>
+              </w:rPr>
+              <w:t xml:space="preserve"> und erreichbare kritische Schwachstellen je Anwendung</w:t>
             </w:r>
           </w:p>
         </w:tc>
@@ -1863,10 +2330,37 @@
             </w:pPr>
             <w:r>
               <w:rPr>
-                <w:sz w:val="22"/>
-                <w:szCs w:val="22"/>
-              </w:rPr>
-              <w:t xml:space="preserve">DORA verlangt ein strukturiertes Management dieser Abhängigkeiten. Die EBA hat im September 2026 Leitlinien auch für Drittparteien außerhalb des IKT-Bereichs finalisiert.</w:t>
+                <w:b/>
+                <w:bCs/>
+                <w:color w:val="050A30"/>
+                <w:sz w:val="22"/>
+                <w:szCs w:val="22"/>
+              </w:rPr>
+              <w:t xml:space="preserve">DORA</w:t>
+            </w:r>
+            <w:r>
+              <w:rPr>
+                <w:sz w:val="22"/>
+                <w:szCs w:val="22"/>
+              </w:rPr>
+              <w:t xml:space="preserve"> verlangt ein strukturiertes Management dieser Abhängigkeiten. Die EBA hat im </w:t>
+            </w:r>
+            <w:r>
+              <w:rPr>
+                <w:b/>
+                <w:bCs/>
+                <w:color w:val="050A30"/>
+                <w:sz w:val="22"/>
+                <w:szCs w:val="22"/>
+              </w:rPr>
+              <w:t xml:space="preserve">September 2026</w:t>
+            </w:r>
+            <w:r>
+              <w:rPr>
+                <w:sz w:val="22"/>
+                <w:szCs w:val="22"/>
+              </w:rPr>
+              <w:t xml:space="preserve"> Leitlinien auch für Drittparteien außerhalb des IKT-Bereichs finalisiert.</w:t>
             </w:r>
           </w:p>
         </w:tc>
@@ -1911,7 +2405,41 @@
                 <w:sz w:val="22"/>
                 <w:szCs w:val="22"/>
               </w:rPr>
-              <w:t xml:space="preserve">Hinter einer Anwendung stehen oft mehrere Anbieter und Subunternehmer. Die Informationen dazu liegen verteilt in Vertragsmanagement, IT-Architektur, Prozessdokumentation und Risikomanagement.</w:t>
+              <w:t xml:space="preserve">Hinter einer Anwendung stehen oft </w:t>
+            </w:r>
+            <w:r>
+              <w:rPr>
+                <w:b/>
+                <w:bCs/>
+                <w:color w:val="050A30"/>
+                <w:sz w:val="22"/>
+                <w:szCs w:val="22"/>
+              </w:rPr>
+              <w:t xml:space="preserve">mehrere Anbieter und Subunternehmer</w:t>
+            </w:r>
+            <w:r>
+              <w:rPr>
+                <w:sz w:val="22"/>
+                <w:szCs w:val="22"/>
+              </w:rPr>
+              <w:t xml:space="preserve">. Die Informationen dazu liegen verteilt in </w:t>
+            </w:r>
+            <w:r>
+              <w:rPr>
+                <w:b/>
+                <w:bCs/>
+                <w:color w:val="050A30"/>
+                <w:sz w:val="22"/>
+                <w:szCs w:val="22"/>
+              </w:rPr>
+              <w:t xml:space="preserve">vier Bereichen</w:t>
+            </w:r>
+            <w:r>
+              <w:rPr>
+                <w:sz w:val="22"/>
+                <w:szCs w:val="22"/>
+              </w:rPr>
+              <w:t xml:space="preserve">: Vertragsmanagement, IT-Architektur, Prozessdokumentation und Risikomanagement.</w:t>
             </w:r>
           </w:p>
           <w:p>
@@ -1968,7 +2496,24 @@
                 <w:sz w:val="22"/>
                 <w:szCs w:val="22"/>
               </w:rPr>
-              <w:t xml:space="preserve">Ein Abhängigkeitsmodell verknüpft Verträge, Dienstleister, Subdienstleisterketten, Systeme und Geschäftsprozesse.</w:t>
+              <w:t xml:space="preserve">Ein </w:t>
+            </w:r>
+            <w:r>
+              <w:rPr>
+                <w:b/>
+                <w:bCs/>
+                <w:color w:val="050A30"/>
+                <w:sz w:val="22"/>
+                <w:szCs w:val="22"/>
+              </w:rPr>
+              <w:t xml:space="preserve">Abhängigkeitsmodell</w:t>
+            </w:r>
+            <w:r>
+              <w:rPr>
+                <w:sz w:val="22"/>
+                <w:szCs w:val="22"/>
+              </w:rPr>
+              <w:t xml:space="preserve"> verknüpft Verträge, Dienstleister, Subdienstleisterketten, Systeme und Geschäftsprozesse.</w:t>
             </w:r>
           </w:p>
           <w:p>
@@ -2115,7 +2660,17 @@
                 <w:sz w:val="20"/>
                 <w:szCs w:val="20"/>
               </w:rPr>
-              <w:t xml:space="preserve">kritischer Abhängigkeiten einschließlich Subdienstleister</w:t>
+              <w:t xml:space="preserve">kritischer Abhängigkeiten </w:t>
+            </w:r>
+            <w:r>
+              <w:rPr>
+                <w:b/>
+                <w:bCs/>
+                <w:color w:val="050A30"/>
+                <w:sz w:val="20"/>
+                <w:szCs w:val="20"/>
+              </w:rPr>
+              <w:t xml:space="preserve">einschließlich Subdienstleister</w:t>
             </w:r>
           </w:p>
         </w:tc>
@@ -2330,7 +2885,24 @@
                 <w:sz w:val="22"/>
                 <w:szCs w:val="22"/>
               </w:rPr>
-              <w:t xml:space="preserve">Zwischen zwei Prüfzeitpunkten entstehende Abweichungen werden erst bei der nächsten Prüfung sichtbar.</w:t>
+              <w:t xml:space="preserve">Zwischen zwei Prüfzeitpunkten entstehende Abweichungen werden </w:t>
+            </w:r>
+            <w:r>
+              <w:rPr>
+                <w:b/>
+                <w:bCs/>
+                <w:color w:val="050A30"/>
+                <w:sz w:val="22"/>
+                <w:szCs w:val="22"/>
+              </w:rPr>
+              <w:t xml:space="preserve">erst bei der nächsten Prüfung</w:t>
+            </w:r>
+            <w:r>
+              <w:rPr>
+                <w:sz w:val="22"/>
+                <w:szCs w:val="22"/>
+              </w:rPr>
+              <w:t xml:space="preserve"> sichtbar, je nach Kontrollfrequenz nach Monaten.</w:t>
             </w:r>
           </w:p>
           <w:p>
@@ -2387,7 +2959,58 @@
                 <w:sz w:val="22"/>
                 <w:szCs w:val="22"/>
               </w:rPr>
-              <w:t xml:space="preserve">Prozess- und Transaktionsdaten werden laufend gegen definierte Kontrollregeln geprüft, etwa Berechtigungsänderung ohne Freigabe, verletzte Funktionstrennung oder Kontrolle ohne vollständigen Nachweis.</w:t>
+              <w:t xml:space="preserve">Prozess- und Transaktionsdaten werden </w:t>
+            </w:r>
+            <w:r>
+              <w:rPr>
+                <w:b/>
+                <w:bCs/>
+                <w:color w:val="050A30"/>
+                <w:sz w:val="22"/>
+                <w:szCs w:val="22"/>
+              </w:rPr>
+              <w:t xml:space="preserve">laufend</w:t>
+            </w:r>
+            <w:r>
+              <w:rPr>
+                <w:sz w:val="22"/>
+                <w:szCs w:val="22"/>
+              </w:rPr>
+              <w:t xml:space="preserve"> gegen definierte Kontrollregeln geprüft, etwa </w:t>
+            </w:r>
+            <w:r>
+              <w:rPr>
+                <w:b/>
+                <w:bCs/>
+                <w:color w:val="050A30"/>
+                <w:sz w:val="22"/>
+                <w:szCs w:val="22"/>
+              </w:rPr>
+              <w:t xml:space="preserve">Berechtigungsänderung ohne Freigabe</w:t>
+            </w:r>
+            <w:r>
+              <w:rPr>
+                <w:sz w:val="22"/>
+                <w:szCs w:val="22"/>
+              </w:rPr>
+              <w:t xml:space="preserve">, </w:t>
+            </w:r>
+            <w:r>
+              <w:rPr>
+                <w:b/>
+                <w:bCs/>
+                <w:color w:val="050A30"/>
+                <w:sz w:val="22"/>
+                <w:szCs w:val="22"/>
+              </w:rPr>
+              <w:t xml:space="preserve">verletzte Funktionstrennung</w:t>
+            </w:r>
+            <w:r>
+              <w:rPr>
+                <w:sz w:val="22"/>
+                <w:szCs w:val="22"/>
+              </w:rPr>
+              <w:t xml:space="preserve"> oder Kontrolle ohne vollständigen Nachweis.</w:t>
             </w:r>
           </w:p>
           <w:p>
@@ -2692,7 +3315,24 @@
                 <w:sz w:val="22"/>
                 <w:szCs w:val="22"/>
               </w:rPr>
-              <w:t xml:space="preserve">Die KfW IPEX-Bank begleitet langfristige Projekte in Energie, Mobilität und Infrastruktur; Ende 2025 lag der Kreditbestand bei 88,9 Mrd. €.</w:t>
+              <w:t xml:space="preserve">Die KfW IPEX-Bank begleitet langfristige Projekte in Energie, Mobilität und Infrastruktur; Ende 2025 lag der Kreditbestand bei </w:t>
+            </w:r>
+            <w:r>
+              <w:rPr>
+                <w:b/>
+                <w:bCs/>
+                <w:color w:val="050A30"/>
+                <w:sz w:val="22"/>
+                <w:szCs w:val="22"/>
+              </w:rPr>
+              <w:t xml:space="preserve">88,9 Mrd. €</w:t>
+            </w:r>
+            <w:r>
+              <w:rPr>
+                <w:sz w:val="22"/>
+                <w:szCs w:val="22"/>
+              </w:rPr>
+              <w:t xml:space="preserve">.</w:t>
             </w:r>
           </w:p>
           <w:p>
@@ -2749,7 +3389,24 @@
                 <w:sz w:val="22"/>
                 <w:szCs w:val="22"/>
               </w:rPr>
-              <w:t xml:space="preserve">Verschlechterungen kündigen sich meist durch mehrere kleine Signale an, verteilt über Dokumente, Quellen und Monate: eine Bauverzögerung, steigende Beschaffungskosten, eine angepasste Prognose eines Auftragnehmers.</w:t>
+              <w:t xml:space="preserve">Verschlechterungen kündigen sich meist durch </w:t>
+            </w:r>
+            <w:r>
+              <w:rPr>
+                <w:b/>
+                <w:bCs/>
+                <w:color w:val="050A30"/>
+                <w:sz w:val="22"/>
+                <w:szCs w:val="22"/>
+              </w:rPr>
+              <w:t xml:space="preserve">mehrere kleine Signale</w:t>
+            </w:r>
+            <w:r>
+              <w:rPr>
+                <w:sz w:val="22"/>
+                <w:szCs w:val="22"/>
+              </w:rPr>
+              <w:t xml:space="preserve"> an, verteilt über Dokumente, Quellen und Monate: eine Bauverzögerung, steigende Beschaffungskosten, eine angepasste Prognose eines Auftragnehmers.</w:t>
             </w:r>
           </w:p>
           <w:p>
@@ -2830,7 +3487,24 @@
                 <w:sz w:val="22"/>
                 <w:szCs w:val="22"/>
               </w:rPr>
-              <w:t xml:space="preserve">Cashflow-, Deckungsgrad- und Risikoberechnungen bleiben in den validierten Modellen.</w:t>
+              <w:t xml:space="preserve">Cashflow-, Deckungsgrad- und Risikoberechnungen bleiben in den </w:t>
+            </w:r>
+            <w:r>
+              <w:rPr>
+                <w:b/>
+                <w:bCs/>
+                <w:color w:val="050A30"/>
+                <w:sz w:val="22"/>
+                <w:szCs w:val="22"/>
+              </w:rPr>
+              <w:t xml:space="preserve">validierten Modellen</w:t>
+            </w:r>
+            <w:r>
+              <w:rPr>
+                <w:sz w:val="22"/>
+                <w:szCs w:val="22"/>
+              </w:rPr>
+              <w:t xml:space="preserve">.</w:t>
             </w:r>
           </w:p>
         </w:tc>
@@ -2914,7 +3588,25 @@
                 <w:sz w:val="20"/>
                 <w:szCs w:val="20"/>
               </w:rPr>
-              <w:t xml:space="preserve">vor Covenant-Verstößen und Ratingveränderungen</w:t>
+              <w:t xml:space="preserve">vor </w:t>
+            </w:r>
+            <w:r>
+              <w:rPr>
+                <w:b/>
+                <w:bCs/>
+                <w:color w:val="050A30"/>
+                <w:sz w:val="20"/>
+                <w:szCs w:val="20"/>
+              </w:rPr>
+              <w:t xml:space="preserve">Covenant-Verstößen</w:t>
+            </w:r>
+            <w:r>
+              <w:rPr>
+                <w:color w:val="6B7080"/>
+                <w:sz w:val="20"/>
+                <w:szCs w:val="20"/>
+              </w:rPr>
+              <w:t xml:space="preserve"> und Ratingveränderungen</w:t>
             </w:r>
           </w:p>
         </w:tc>
@@ -3111,7 +3803,41 @@
                 <w:sz w:val="22"/>
                 <w:szCs w:val="22"/>
               </w:rPr>
-              <w:t xml:space="preserve">Das ECA-Transaktionsvolumen der KfW IPEX-Bank lag 2025 bei rund 4,4 Mrd. €. Die Zahl der Deckungsprodukte der Exportkreditagenturen hat deutlich zugenommen.</w:t>
+              <w:t xml:space="preserve">Das ECA-Transaktionsvolumen der KfW IPEX-Bank lag 2025 bei </w:t>
+            </w:r>
+            <w:r>
+              <w:rPr>
+                <w:b/>
+                <w:bCs/>
+                <w:color w:val="050A30"/>
+                <w:sz w:val="22"/>
+                <w:szCs w:val="22"/>
+              </w:rPr>
+              <w:t xml:space="preserve">rund 4,4 Mrd. €</w:t>
+            </w:r>
+            <w:r>
+              <w:rPr>
+                <w:sz w:val="22"/>
+                <w:szCs w:val="22"/>
+              </w:rPr>
+              <w:t xml:space="preserve">. Die Zahl der Deckungsprodukte der Exportkreditagenturen hat </w:t>
+            </w:r>
+            <w:r>
+              <w:rPr>
+                <w:b/>
+                <w:bCs/>
+                <w:color w:val="050A30"/>
+                <w:sz w:val="22"/>
+                <w:szCs w:val="22"/>
+              </w:rPr>
+              <w:t xml:space="preserve">deutlich zugenommen</w:t>
+            </w:r>
+            <w:r>
+              <w:rPr>
+                <w:sz w:val="22"/>
+                <w:szCs w:val="22"/>
+              </w:rPr>
+              <w:t xml:space="preserve">.</w:t>
             </w:r>
           </w:p>
           <w:p>
@@ -3180,7 +3906,17 @@
                 <w:sz w:val="22"/>
                 <w:szCs w:val="22"/>
               </w:rPr>
-              <w:t xml:space="preserve">Unter Zeitdruck ist es schwierig, alle Varianten gleichwertig zu prüfen. Strukturen, die ein Mandat erst ermöglichen würden, bleiben dann ungeprüft.</w:t>
+              <w:t xml:space="preserve">Unter Zeitdruck ist es schwierig, alle Varianten gleichwertig zu prüfen. </w:t>
+            </w:r>
+            <w:r>
+              <w:rPr>
+                <w:b/>
+                <w:bCs/>
+                <w:color w:val="050A30"/>
+                <w:sz w:val="22"/>
+                <w:szCs w:val="22"/>
+              </w:rPr>
+              <w:t xml:space="preserve">Strukturen, die ein Mandat erst ermöglichen würden, bleiben dann ungeprüft.</w:t>
             </w:r>
           </w:p>
         </w:tc>
@@ -3237,7 +3973,24 @@
                 <w:sz w:val="22"/>
                 <w:szCs w:val="22"/>
               </w:rPr>
-              <w:t xml:space="preserve">Das System stellt Strukturvarianten mit Voraussetzungen, Risikoaufteilung und wirtschaftlicher Einschätzung gegenüber.</w:t>
+              <w:t xml:space="preserve">Das System stellt </w:t>
+            </w:r>
+            <w:r>
+              <w:rPr>
+                <w:b/>
+                <w:bCs/>
+                <w:color w:val="050A30"/>
+                <w:sz w:val="22"/>
+                <w:szCs w:val="22"/>
+              </w:rPr>
+              <w:t xml:space="preserve">zwei bis drei Strukturvarianten</w:t>
+            </w:r>
+            <w:r>
+              <w:rPr>
+                <w:sz w:val="22"/>
+                <w:szCs w:val="22"/>
+              </w:rPr>
+              <w:t xml:space="preserve"> mit Voraussetzungen, Risikoaufteilung und wirtschaftlicher Einschätzung gegenüber.</w:t>
             </w:r>
           </w:p>
           <w:p>
@@ -3411,7 +4164,43 @@
                 <w:sz w:val="20"/>
                 <w:szCs w:val="20"/>
               </w:rPr>
-              <w:t xml:space="preserve">Bruttoertrag je Zusatzmandat bei 150 Mio. € und 20 bp (Annahme)</w:t>
+              <w:t xml:space="preserve">Bruttoertrag je Zusatzmandat bei </w:t>
+            </w:r>
+            <w:r>
+              <w:rPr>
+                <w:b/>
+                <w:bCs/>
+                <w:color w:val="050A30"/>
+                <w:sz w:val="20"/>
+                <w:szCs w:val="20"/>
+              </w:rPr>
+              <w:t xml:space="preserve">150 Mio. € Volumen</w:t>
+            </w:r>
+            <w:r>
+              <w:rPr>
+                <w:color w:val="6B7080"/>
+                <w:sz w:val="20"/>
+                <w:szCs w:val="20"/>
+              </w:rPr>
+              <w:t xml:space="preserve"> und </w:t>
+            </w:r>
+            <w:r>
+              <w:rPr>
+                <w:b/>
+                <w:bCs/>
+                <w:color w:val="050A30"/>
+                <w:sz w:val="20"/>
+                <w:szCs w:val="20"/>
+              </w:rPr>
+              <w:t xml:space="preserve">20 bp</w:t>
+            </w:r>
+            <w:r>
+              <w:rPr>
+                <w:color w:val="6B7080"/>
+                <w:sz w:val="20"/>
+                <w:szCs w:val="20"/>
+              </w:rPr>
+              <w:t xml:space="preserve"> (Annahme)</w:t>
             </w:r>
           </w:p>
         </w:tc>
@@ -3542,7 +4331,24 @@
                 <w:sz w:val="22"/>
                 <w:szCs w:val="22"/>
               </w:rPr>
-              <w:t xml:space="preserve">Die KfW IPEX-Bank wies 2025 ein arrangiertes Syndizierungsvolumen von 6,9 Mrd. € aus. Großvolumige Finanzierungen werden mit Banken und institutionellen Investoren geteilt.</w:t>
+              <w:t xml:space="preserve">Die KfW IPEX-Bank wies 2025 ein arrangiertes Syndizierungsvolumen von </w:t>
+            </w:r>
+            <w:r>
+              <w:rPr>
+                <w:b/>
+                <w:bCs/>
+                <w:color w:val="050A30"/>
+                <w:sz w:val="22"/>
+                <w:szCs w:val="22"/>
+              </w:rPr>
+              <w:t xml:space="preserve">6,9 Mrd. €</w:t>
+            </w:r>
+            <w:r>
+              <w:rPr>
+                <w:sz w:val="22"/>
+                <w:szCs w:val="22"/>
+              </w:rPr>
+              <w:t xml:space="preserve"> aus. Großvolumige Finanzierungen werden mit Banken und institutionellen Investoren geteilt.</w:t>
             </w:r>
           </w:p>
           <w:p>
@@ -3611,7 +4417,24 @@
                 <w:sz w:val="22"/>
                 <w:szCs w:val="22"/>
               </w:rPr>
-              <w:t xml:space="preserve">Ein großer Teil dieses Wissens liegt in abgeschlossenen Transaktionen und bei einzelnen Personen, nicht in einem auswertbaren System.</w:t>
+              <w:t xml:space="preserve">Ein großer Teil dieses Wissens liegt in abgeschlossenen Transaktionen und bei einzelnen Personen, </w:t>
+            </w:r>
+            <w:r>
+              <w:rPr>
+                <w:b/>
+                <w:bCs/>
+                <w:color w:val="050A30"/>
+                <w:sz w:val="22"/>
+                <w:szCs w:val="22"/>
+              </w:rPr>
+              <w:t xml:space="preserve">nicht in einem auswertbaren System</w:t>
+            </w:r>
+            <w:r>
+              <w:rPr>
+                <w:sz w:val="22"/>
+                <w:szCs w:val="22"/>
+              </w:rPr>
+              <w:t xml:space="preserve">.</w:t>
             </w:r>
           </w:p>
         </w:tc>
@@ -3668,7 +4491,24 @@
                 <w:sz w:val="22"/>
                 <w:szCs w:val="22"/>
               </w:rPr>
-              <w:t xml:space="preserve">Es schlägt Partner und Strukturvarianten vor und vergleicht Szenarien nach Platzierbarkeit, Kapitalbindung und Ergebnis, auf Basis der bestehenden Risikomodelle.</w:t>
+              <w:t xml:space="preserve">Es schlägt Partner und Strukturvarianten vor und vergleicht Szenarien nach </w:t>
+            </w:r>
+            <w:r>
+              <w:rPr>
+                <w:b/>
+                <w:bCs/>
+                <w:color w:val="050A30"/>
+                <w:sz w:val="22"/>
+                <w:szCs w:val="22"/>
+              </w:rPr>
+              <w:t xml:space="preserve">Platzierbarkeit, Kapitalbindung und Ergebnis</w:t>
+            </w:r>
+            <w:r>
+              <w:rPr>
+                <w:sz w:val="22"/>
+                <w:szCs w:val="22"/>
+              </w:rPr>
+              <w:t xml:space="preserve">, auf Basis der bestehenden Risikomodelle.</w:t>
             </w:r>
           </w:p>
           <w:p>

</xml_diff>